<commit_message>
Flatten independent claims to fully continuous paragraphs
Patent Center's DOCX validator was still flagging claims as
multi-sentence/missing-period/improperly-dependent even after
converting from bullet lists to hard-line-break-separated clauses,
indicating its parser treats any manual line break as a segment
boundary, not just list items. Removes all internal line breaks so
each independent claim is one uninterrupted paragraph, matching
conventional patent claim formatting.

Co-Authored-By: Claude Sonnet 5 <noreply@anthropic.com>
</commit_message>
<xml_diff>
--- a/patent_application/non_provisional/submittal_docs/non_provisional_written_description.docx
+++ b/patent_application/non_provisional/submittal_docs/non_provisional_written_description.docx
@@ -2344,61 +2344,7 @@
         </w:numPr>
       </w:pPr>
       <w:r>
-        <w:t xml:space="preserve">A computer-implemented method for generating a course knowledge base as a property graph, comprising:</w:t>
-      </w:r>
-      <w:r>
-        <w:br/>
-      </w:r>
-      <w:r>
-        <w:t xml:space="preserve">receiving a subject description;</w:t>
-      </w:r>
-      <w:r>
-        <w:br/>
-      </w:r>
-      <w:r>
-        <w:t xml:space="preserve">querying an AI agent, using a subject-agnostic prompt, to generate a set of topic nodes for the subject;</w:t>
-      </w:r>
-      <w:r>
-        <w:br/>
-      </w:r>
-      <w:r>
-        <w:t xml:space="preserve">presenting the set of topic nodes to a human reviewer via a graphical interface prior to further generation, the reviewer being permitted to omit or add topic nodes;</w:t>
-      </w:r>
-      <w:r>
-        <w:br/>
-      </w:r>
-      <w:r>
-        <w:t xml:space="preserve">responsive to reviewer confirmation, querying the AI agent to generate, for each confirmed topic node, study content and one or more assessment questions;</w:t>
-      </w:r>
-      <w:r>
-        <w:br/>
-      </w:r>
-      <w:r>
-        <w:t xml:space="preserve">querying the AI agent to generate a bounded vocabulary of relationship types, each relationship type comprising a label and an archetype classification, from the generated study content across the confirmed topic nodes;</w:t>
-      </w:r>
-      <w:r>
-        <w:br/>
-      </w:r>
-      <w:r>
-        <w:t xml:space="preserve">querying the AI agent to assign, between pairs of the confirmed topic nodes, a relationship type selected from the generated vocabulary, and validating the assigned relationships by removing relationships referencing a topic node not among the confirmed topic nodes, self-referential relationships, and duplicate relationships;</w:t>
-      </w:r>
-      <w:r>
-        <w:br/>
-      </w:r>
-      <w:r>
-        <w:t xml:space="preserve">querying the AI agent to generate prerequisite relationships between the confirmed topic nodes, identifying cycles among the generated prerequisite relationships, and deterministically removing edges from any identified cycle according to a fixed rule until no cycles remain;</w:t>
-      </w:r>
-      <w:r>
-        <w:br/>
-      </w:r>
-      <w:r>
-        <w:t xml:space="preserve">computing, for each topic node, an importance score based on a graph-centrality measure of the topic node within the prerequisite relationships; and</w:t>
-      </w:r>
-      <w:r>
-        <w:br/>
-      </w:r>
-      <w:r>
-        <w:t xml:space="preserve">storing the topic nodes, study content, assessment questions, relationship types, prerequisite relationships, and importance scores as nodes and edges of a property graph in a graph database.</w:t>
+        <w:t xml:space="preserve">A computer-implemented method for generating a course knowledge base as a property graph, comprising: receiving a subject description; querying an AI agent, using a subject-agnostic prompt, to generate a set of topic nodes for the subject; presenting the set of topic nodes to a human reviewer via a graphical interface prior to further generation, the reviewer being permitted to omit or add topic nodes; responsive to reviewer confirmation, querying the AI agent to generate, for each confirmed topic node, study content and one or more assessment questions; querying the AI agent to generate a bounded vocabulary of relationship types, each relationship type comprising a label and an archetype classification, from the generated study content across the confirmed topic nodes; querying the AI agent to assign, between pairs of the confirmed topic nodes, a relationship type selected from the generated vocabulary, and validating the assigned relationships by removing relationships referencing a topic node not among the confirmed topic nodes, self-referential relationships, and duplicate relationships; querying the AI agent to generate prerequisite relationships between the confirmed topic nodes, identifying cycles among the generated prerequisite relationships, and deterministically removing edges from any identified cycle according to a fixed rule until no cycles remain; computing, for each topic node, an importance score based on a graph-centrality measure of the topic node within the prerequisite relationships; and storing the topic nodes, study content, assessment questions, relationship types, prerequisite relationships, and importance scores as nodes and edges of a property graph in a graph database.</w:t>
       </w:r>
     </w:p>
     <w:p>
@@ -2474,37 +2420,7 @@
         </w:numPr>
       </w:pPr>
       <w:r>
-        <w:t xml:space="preserve">A computer-implemented method for delivering adaptive online learning using a course knowledge base comprising topic nodes connected by prerequisite relationships, comprising:</w:t>
-      </w:r>
-      <w:r>
-        <w:br/>
-      </w:r>
-      <w:r>
-        <w:t xml:space="preserve">recording, for a user, a mastery indication for each of a plurality of topic nodes;</w:t>
-      </w:r>
-      <w:r>
-        <w:br/>
-      </w:r>
-      <w:r>
-        <w:t xml:space="preserve">determining, for a given topic node, that the user is ready to study the given topic node when the user has a recorded mastery indication for each topic node connected to the given topic node by a direct prerequisite relationship;</w:t>
-      </w:r>
-      <w:r>
-        <w:br/>
-      </w:r>
-      <w:r>
-        <w:t xml:space="preserve">responsive to a user selection of any topic node in the course knowledge base as a learning goal, identifying a transitive-prerequisite subgraph of the selected topic node, and generating an ordered learning path through the subgraph by topologically sorting the subgraph such that each topic node precedes every topic node for which it is a prerequisite;</w:t>
-      </w:r>
-      <w:r>
-        <w:br/>
-      </w:r>
-      <w:r>
-        <w:t xml:space="preserve">where two or more topic nodes are available to be ordered next in the topological sort, selecting among them using a precomputed importance score associated with each topic node; and</w:t>
-      </w:r>
-      <w:r>
-        <w:br/>
-      </w:r>
-      <w:r>
-        <w:t xml:space="preserve">presenting the ordered learning path to the user.</w:t>
+        <w:t xml:space="preserve">A computer-implemented method for delivering adaptive online learning using a course knowledge base comprising topic nodes connected by prerequisite relationships, comprising: recording, for a user, a mastery indication for each of a plurality of topic nodes; determining, for a given topic node, that the user is ready to study the given topic node when the user has a recorded mastery indication for each topic node connected to the given topic node by a direct prerequisite relationship; responsive to a user selection of any topic node in the course knowledge base as a learning goal, identifying a transitive-prerequisite subgraph of the selected topic node, and generating an ordered learning path through the subgraph by topologically sorting the subgraph such that each topic node precedes every topic node for which it is a prerequisite; where two or more topic nodes are available to be ordered next in the topological sort, selecting among them using a precomputed importance score associated with each topic node; and presenting the ordered learning path to the user.</w:t>
       </w:r>
     </w:p>
     <w:p>
@@ -2580,25 +2496,7 @@
         </w:numPr>
       </w:pPr>
       <w:r>
-        <w:t xml:space="preserve">A computer-implemented method for generating typed relationships among a set of AI-generated content items, comprising:</w:t>
-      </w:r>
-      <w:r>
-        <w:br/>
-      </w:r>
-      <w:r>
-        <w:t xml:space="preserve">querying an AI agent to generate a bounded vocabulary of relationship types from a corpus of content items, each relationship type comprising a label and an archetype classification selected from a fixed set of archetypes;</w:t>
-      </w:r>
-      <w:r>
-        <w:br/>
-      </w:r>
-      <w:r>
-        <w:t xml:space="preserve">querying the AI agent, in batches, to assign relationship types selected from the generated vocabulary between pairs of content items, together with a natural-language description of each assigned relationship; and</w:t>
-      </w:r>
-      <w:r>
-        <w:br/>
-      </w:r>
-      <w:r>
-        <w:t xml:space="preserve">validating the assigned relationships by discarding relationships that reference a content item not present in the corpus, relationships between a content item and itself, and duplicate relationships between the same pair of content items.</w:t>
+        <w:t xml:space="preserve">A computer-implemented method for generating typed relationships among a set of AI-generated content items, comprising: querying an AI agent to generate a bounded vocabulary of relationship types from a corpus of content items, each relationship type comprising a label and an archetype classification selected from a fixed set of archetypes; querying the AI agent, in batches, to assign relationship types selected from the generated vocabulary between pairs of content items, together with a natural-language description of each assigned relationship; and validating the assigned relationships by discarding relationships that reference a content item not present in the corpus, relationships between a content item and itself, and duplicate relationships between the same pair of content items.</w:t>
       </w:r>
     </w:p>
     <w:p>
@@ -2652,37 +2550,7 @@
         </w:numPr>
       </w:pPr>
       <w:r>
-        <w:t xml:space="preserve">A computer-implemented method for eliciting a structured course-creation brief via conversational interaction, comprising:</w:t>
-      </w:r>
-      <w:r>
-        <w:br/>
-      </w:r>
-      <w:r>
-        <w:t xml:space="preserve">conducting, via an AI agent, a bounded-turn conversational interview with a user, the interview limited to a maximum number of interview questions;</w:t>
-      </w:r>
-      <w:r>
-        <w:br/>
-      </w:r>
-      <w:r>
-        <w:t xml:space="preserve">accepting, during the interview, one or more file attachments from the user, the file attachments comprising at least one of a document, an image, or a portable document format file;</w:t>
-      </w:r>
-      <w:r>
-        <w:br/>
-      </w:r>
-      <w:r>
-        <w:t xml:space="preserve">extracting information relevant to the course-creation brief from the accepted file attachments;</w:t>
-      </w:r>
-      <w:r>
-        <w:br/>
-      </w:r>
-      <w:r>
-        <w:t xml:space="preserve">populating a structured brief comprising a plurality of fixed fields, including a target audience, a coverage overview, a desired outcome, and a tone-and-style descriptor, from the conversational interaction and the extracted information; and</w:t>
-      </w:r>
-      <w:r>
-        <w:br/>
-      </w:r>
-      <w:r>
-        <w:t xml:space="preserve">providing the structured brief as input to a course-knowledge-base generation process.</w:t>
+        <w:t xml:space="preserve">A computer-implemented method for eliciting a structured course-creation brief via conversational interaction, comprising: conducting, via an AI agent, a bounded-turn conversational interview with a user, the interview limited to a maximum number of interview questions; accepting, during the interview, one or more file attachments from the user, the file attachments comprising at least one of a document, an image, or a portable document format file; extracting information relevant to the course-creation brief from the accepted file attachments; populating a structured brief comprising a plurality of fixed fields, including a target audience, a coverage overview, a desired outcome, and a tone-and-style descriptor, from the conversational interaction and the extracted information; and providing the structured brief as input to a course-knowledge-base generation process.</w:t>
       </w:r>
     </w:p>
     <w:p>
@@ -2725,37 +2593,7 @@
         </w:numPr>
       </w:pPr>
       <w:r>
-        <w:t xml:space="preserve">A computer-implemented method for searching a course knowledge base generated by an AI agent, the course knowledge base comprising a plurality of domain nodes each associated with a summary embedding, and a plurality of topic nodes each associated with a content embedding, the method comprising:</w:t>
-      </w:r>
-      <w:r>
-        <w:br/>
-      </w:r>
-      <w:r>
-        <w:t xml:space="preserve">receiving a search query;</w:t>
-      </w:r>
-      <w:r>
-        <w:br/>
-      </w:r>
-      <w:r>
-        <w:t xml:space="preserve">generating a query embedding from the search query;</w:t>
-      </w:r>
-      <w:r>
-        <w:br/>
-      </w:r>
-      <w:r>
-        <w:t xml:space="preserve">responsive to a first search mode, comparing the query embedding against the summary embeddings to identify a set of candidate domain nodes, and filtering the set of candidate domain nodes by a first similarity threshold;</w:t>
-      </w:r>
-      <w:r>
-        <w:br/>
-      </w:r>
-      <w:r>
-        <w:t xml:space="preserve">responsive to a second search mode, comparing the query embedding against the content embeddings to identify a set of candidate topic nodes, reranking the set of candidate topic nodes using a reranking model that jointly evaluates the search query and content of each candidate topic node, and filtering the reranked candidate topic nodes by a second similarity threshold; and</w:t>
-      </w:r>
-      <w:r>
-        <w:br/>
-      </w:r>
-      <w:r>
-        <w:t xml:space="preserve">returning the filtered candidate nodes in response to the search query.</w:t>
+        <w:t xml:space="preserve">A computer-implemented method for searching a course knowledge base generated by an AI agent, the course knowledge base comprising a plurality of domain nodes each associated with a summary embedding, and a plurality of topic nodes each associated with a content embedding, the method comprising: receiving a search query; generating a query embedding from the search query; responsive to a first search mode, comparing the query embedding against the summary embeddings to identify a set of candidate domain nodes, and filtering the set of candidate domain nodes by a first similarity threshold; responsive to a second search mode, comparing the query embedding against the content embeddings to identify a set of candidate topic nodes, reranking the set of candidate topic nodes using a reranking model that jointly evaluates the search query and content of each candidate topic node, and filtering the reranked candidate topic nodes by a second similarity threshold; and returning the filtered candidate nodes in response to the search query.</w:t>
       </w:r>
     </w:p>
     <w:p>
@@ -2798,31 +2636,7 @@
         </w:numPr>
       </w:pPr>
       <w:r>
-        <w:t xml:space="preserve">A computer-implemented method for navigating a course knowledge base via an interactive graph view, the course knowledge base comprising topic nodes connected by prerequisite relationships and typed structural relationships, the method comprising:</w:t>
-      </w:r>
-      <w:r>
-        <w:br/>
-      </w:r>
-      <w:r>
-        <w:t xml:space="preserve">displaying a graph view centered on a currently-selected topic node, the graph view including each topic node directly connected to the currently-selected topic node by a prerequisite relationship or a typed structural relationship, in either direction;</w:t>
-      </w:r>
-      <w:r>
-        <w:br/>
-      </w:r>
-      <w:r>
-        <w:t xml:space="preserve">determining, for each displayed neighboring topic node, a mastery-relative visual state selected from at least four states: mastered by the user, recommended next, ready to be studied, and not yet ready to be studied;</w:t>
-      </w:r>
-      <w:r>
-        <w:br/>
-      </w:r>
-      <w:r>
-        <w:t xml:space="preserve">rendering each displayed neighboring topic node according to its determined mastery-relative visual state; and</w:t>
-      </w:r>
-      <w:r>
-        <w:br/>
-      </w:r>
-      <w:r>
-        <w:t xml:space="preserve">responsive to a user selection of a displayed neighboring topic node, re-centering the graph view on the selected topic node and displaying the topic nodes directly connected to it, thereby enabling the user to navigate the course knowledge base by traversing structural and prerequisite relationships one topic node at a time.</w:t>
+        <w:t xml:space="preserve">A computer-implemented method for navigating a course knowledge base via an interactive graph view, the course knowledge base comprising topic nodes connected by prerequisite relationships and typed structural relationships, the method comprising: displaying a graph view centered on a currently-selected topic node, the graph view including each topic node directly connected to the currently-selected topic node by a prerequisite relationship or a typed structural relationship, in either direction; determining, for each displayed neighboring topic node, a mastery-relative visual state selected from at least four states: mastered by the user, recommended next, ready to be studied, and not yet ready to be studied; rendering each displayed neighboring topic node according to its determined mastery-relative visual state; and responsive to a user selection of a displayed neighboring topic node, re-centering the graph view on the selected topic node and displaying the topic nodes directly connected to it, thereby enabling the user to navigate the course knowledge base by traversing structural and prerequisite relationships one topic node at a time.</w:t>
       </w:r>
     </w:p>
     <w:p>

</xml_diff>

<commit_message>
Fix remaining dependent claims that cross-reference two claim families
Patent Center's DOCX feedback (comments.xml in the downloaded feedback
document) precisely identified claims 12, 18, and 22 as each citing two
unrelated claim numbers (their own dependency plus an unrelated
reference to claim 1) -- the same pattern already fixed in claim 27.
Rewrites all three to restate the borrowed limitation in plain language
instead of citing "claim 1" by number, resolving the "references two
sets of claims" and "improper dependency" warnings (3 instances each,
now traced to exactly these three claims).

Co-Authored-By: Claude Sonnet 5 <noreply@anthropic.com>
</commit_message>
<xml_diff>
--- a/patent_application/non_provisional/submittal_docs/non_provisional_written_description.docx
+++ b/patent_application/non_provisional/submittal_docs/non_provisional_written_description.docx
@@ -2475,7 +2475,7 @@
         </w:numPr>
       </w:pPr>
       <w:r>
-        <w:t xml:space="preserve">A computer system configured to implement the method of claim 7, operable with any course knowledge base conforming to the property-graph structure of claim 1.</w:t>
+        <w:t xml:space="preserve">A computer system configured to implement the method of claim 7, operable with any course knowledge base structured as a property graph comprising topic nodes connected by prerequisite relationships.</w:t>
       </w:r>
     </w:p>
     <w:bookmarkEnd w:id="38"/>
@@ -2561,7 +2561,7 @@
         </w:numPr>
       </w:pPr>
       <w:r>
-        <w:t xml:space="preserve">The method of claim 17, wherein the course-knowledge-base generation process comprises the method of claim 1.</w:t>
+        <w:t xml:space="preserve">The method of claim 17, wherein the course-knowledge-base generation process comprises querying an AI agent to generate topic nodes, prerequisite relationships, and typed structural relationships, and storing them as a property graph in a graph database.</w:t>
       </w:r>
     </w:p>
     <w:p>
@@ -2615,7 +2615,7 @@
         </w:numPr>
       </w:pPr>
       <w:r>
-        <w:t xml:space="preserve">The method of claim 20, wherein the course knowledge base is generated according to the method of claim 1.</w:t>
+        <w:t xml:space="preserve">The method of claim 20, wherein the course knowledge base is generated by querying an AI agent to generate topic nodes, prerequisite relationships, and typed structural relationships, and storing them as a property graph in a graph database.</w:t>
       </w:r>
     </w:p>
     <w:bookmarkEnd w:id="41"/>

</xml_diff>

<commit_message>
Fix bullet lists rendering as run-on text in DOCX/PDF output
Several bullet lists (Background of the Invention, and each Invention's
Embodiments/Core Logic/Features sections) immediately followed a
non-blank line with no intervening blank line, which pandoc's markdown
reader requires to recognize a list interrupting a paragraph. Without
it, list items were merged into the preceding paragraph as literal
"- " text rather than rendering as an actual bulleted list. Content/
meaning is unaffected (purely cosmetic), but corrected for a clean
record going forward.

Co-Authored-By: Claude Sonnet 5 <noreply@anthropic.com>
</commit_message>
<xml_diff>
--- a/patent_application/non_provisional/submittal_docs/non_provisional_written_description.docx
+++ b/patent_application/non_provisional/submittal_docs/non_provisional_written_description.docx
@@ -128,58 +128,106 @@
       <w:r>
         <w:t xml:space="preserve">Traditional learning management systems and online course creation platforms face significant limitations:</w:t>
       </w:r>
-      <w:r>
-        <w:t xml:space="preserve"> </w:t>
-      </w:r>
-      <w:r>
-        <w:t xml:space="preserve">- Manual content creation is slow and costly.</w:t>
-      </w:r>
-      <w:r>
-        <w:t xml:space="preserve"> </w:t>
-      </w:r>
-      <w:r>
-        <w:t xml:space="preserve">- Learning pathways are rigid and do not adapt to individual mastery levels.</w:t>
-      </w:r>
-      <w:r>
-        <w:t xml:space="preserve"> </w:t>
-      </w:r>
-      <w:r>
-        <w:t xml:space="preserve">- Prerequisite enforcement is minimal or non-existent.</w:t>
-      </w:r>
-      <w:r>
-        <w:t xml:space="preserve"> </w:t>
-      </w:r>
-      <w:r>
-        <w:t xml:space="preserve">- Adding new subjects requires substantial manual effort.</w:t>
-      </w:r>
-      <w:r>
-        <w:t xml:space="preserve"> </w:t>
-      </w:r>
-      <w:r>
-        <w:t xml:space="preserve">- Relationships between concepts beyond simple prerequisite ordering (e.g., causal, functional, or hierarchical relationships) are rarely captured, and when captured, are manually authored.</w:t>
-      </w:r>
-      <w:r>
-        <w:t xml:space="preserve"> </w:t>
-      </w:r>
-      <w:r>
-        <w:t xml:space="preserve">- Locating relevant content within a large, AI-generated body of course material is difficult without a search mechanism tuned to the structure of that content.</w:t>
-      </w:r>
-      <w:r>
-        <w:t xml:space="preserve"> </w:t>
-      </w:r>
-      <w:r>
-        <w:t xml:space="preserve">- Specifying the parameters of a new course (audience, scope, tone, desired outcome) is itself a manual, unstructured process that does not integrate with automated content generation.</w:t>
-      </w:r>
-      <w:r>
-        <w:t xml:space="preserve"> </w:t>
-      </w:r>
-      <w:r>
-        <w:t xml:space="preserve">- Graph-based visualizations of course content are typically generic, showing structural connections without regard to an individual user’s mastery of the connected material, and without a means of prioritizing which connections are most worth the user’s attention.</w:t>
-      </w:r>
-    </w:p>
-    <w:p>
-      <w:pPr>
-        <w:pStyle w:val="BodyText"/>
+    </w:p>
+    <w:p>
+      <w:pPr>
+        <w:pStyle w:val="Compact"/>
+        <w:numPr>
+          <w:ilvl w:val="0"/>
+          <w:numId w:val="1001"/>
+        </w:numPr>
+      </w:pPr>
+      <w:r>
+        <w:t xml:space="preserve">Manual content creation is slow and costly.</w:t>
+      </w:r>
+    </w:p>
+    <w:p>
+      <w:pPr>
+        <w:pStyle w:val="Compact"/>
+        <w:numPr>
+          <w:ilvl w:val="0"/>
+          <w:numId w:val="1001"/>
+        </w:numPr>
+      </w:pPr>
+      <w:r>
+        <w:t xml:space="preserve">Learning pathways are rigid and do not adapt to individual mastery levels.</w:t>
+      </w:r>
+    </w:p>
+    <w:p>
+      <w:pPr>
+        <w:pStyle w:val="Compact"/>
+        <w:numPr>
+          <w:ilvl w:val="0"/>
+          <w:numId w:val="1001"/>
+        </w:numPr>
+      </w:pPr>
+      <w:r>
+        <w:t xml:space="preserve">Prerequisite enforcement is minimal or non-existent.</w:t>
+      </w:r>
+    </w:p>
+    <w:p>
+      <w:pPr>
+        <w:pStyle w:val="Compact"/>
+        <w:numPr>
+          <w:ilvl w:val="0"/>
+          <w:numId w:val="1001"/>
+        </w:numPr>
+      </w:pPr>
+      <w:r>
+        <w:t xml:space="preserve">Adding new subjects requires substantial manual effort.</w:t>
+      </w:r>
+    </w:p>
+    <w:p>
+      <w:pPr>
+        <w:pStyle w:val="Compact"/>
+        <w:numPr>
+          <w:ilvl w:val="0"/>
+          <w:numId w:val="1001"/>
+        </w:numPr>
+      </w:pPr>
+      <w:r>
+        <w:t xml:space="preserve">Relationships between concepts beyond simple prerequisite ordering (e.g., causal, functional, or hierarchical relationships) are rarely captured, and when captured, are manually authored.</w:t>
+      </w:r>
+    </w:p>
+    <w:p>
+      <w:pPr>
+        <w:pStyle w:val="Compact"/>
+        <w:numPr>
+          <w:ilvl w:val="0"/>
+          <w:numId w:val="1001"/>
+        </w:numPr>
+      </w:pPr>
+      <w:r>
+        <w:t xml:space="preserve">Locating relevant content within a large, AI-generated body of course material is difficult without a search mechanism tuned to the structure of that content.</w:t>
+      </w:r>
+    </w:p>
+    <w:p>
+      <w:pPr>
+        <w:pStyle w:val="Compact"/>
+        <w:numPr>
+          <w:ilvl w:val="0"/>
+          <w:numId w:val="1001"/>
+        </w:numPr>
+      </w:pPr>
+      <w:r>
+        <w:t xml:space="preserve">Specifying the parameters of a new course (audience, scope, tone, desired outcome) is itself a manual, unstructured process that does not integrate with automated content generation.</w:t>
+      </w:r>
+    </w:p>
+    <w:p>
+      <w:pPr>
+        <w:pStyle w:val="Compact"/>
+        <w:numPr>
+          <w:ilvl w:val="0"/>
+          <w:numId w:val="1001"/>
+        </w:numPr>
+      </w:pPr>
+      <w:r>
+        <w:t xml:space="preserve">Graph-based visualizations of course content are typically generic, showing structural connections without regard to an individual user’s mastery of the connected material, and without a means of prioritizing which connections are most worth the user’s attention.</w:t>
+      </w:r>
+    </w:p>
+    <w:p>
+      <w:pPr>
+        <w:pStyle w:val="FirstParagraph"/>
       </w:pPr>
       <w:r>
         <w:t xml:space="preserve">These limitations reduce scalability, personalization, and the ability to deliver comprehensive coverage in diverse domains.</w:t>
@@ -208,7 +256,7 @@
         <w:pStyle w:val="Compact"/>
         <w:numPr>
           <w:ilvl w:val="0"/>
-          <w:numId w:val="1001"/>
+          <w:numId w:val="1002"/>
         </w:numPr>
       </w:pPr>
       <w:r>
@@ -230,7 +278,7 @@
         <w:pStyle w:val="Compact"/>
         <w:numPr>
           <w:ilvl w:val="0"/>
-          <w:numId w:val="1001"/>
+          <w:numId w:val="1002"/>
         </w:numPr>
       </w:pPr>
       <w:r>
@@ -252,7 +300,7 @@
         <w:pStyle w:val="Compact"/>
         <w:numPr>
           <w:ilvl w:val="0"/>
-          <w:numId w:val="1001"/>
+          <w:numId w:val="1002"/>
         </w:numPr>
       </w:pPr>
       <w:r>
@@ -274,7 +322,7 @@
         <w:pStyle w:val="Compact"/>
         <w:numPr>
           <w:ilvl w:val="0"/>
-          <w:numId w:val="1001"/>
+          <w:numId w:val="1002"/>
         </w:numPr>
       </w:pPr>
       <w:r>
@@ -296,7 +344,7 @@
         <w:pStyle w:val="Compact"/>
         <w:numPr>
           <w:ilvl w:val="0"/>
-          <w:numId w:val="1001"/>
+          <w:numId w:val="1002"/>
         </w:numPr>
       </w:pPr>
       <w:r>
@@ -318,7 +366,7 @@
         <w:pStyle w:val="Compact"/>
         <w:numPr>
           <w:ilvl w:val="0"/>
-          <w:numId w:val="1001"/>
+          <w:numId w:val="1002"/>
         </w:numPr>
       </w:pPr>
       <w:r>
@@ -350,7 +398,7 @@
         <w:pStyle w:val="Compact"/>
         <w:numPr>
           <w:ilvl w:val="0"/>
-          <w:numId w:val="1002"/>
+          <w:numId w:val="1003"/>
         </w:numPr>
       </w:pPr>
       <w:r>
@@ -381,7 +429,7 @@
         <w:pStyle w:val="Compact"/>
         <w:numPr>
           <w:ilvl w:val="0"/>
-          <w:numId w:val="1002"/>
+          <w:numId w:val="1003"/>
         </w:numPr>
       </w:pPr>
       <w:r>
@@ -412,7 +460,7 @@
         <w:pStyle w:val="Compact"/>
         <w:numPr>
           <w:ilvl w:val="0"/>
-          <w:numId w:val="1002"/>
+          <w:numId w:val="1003"/>
         </w:numPr>
       </w:pPr>
       <w:r>
@@ -443,7 +491,7 @@
         <w:pStyle w:val="Compact"/>
         <w:numPr>
           <w:ilvl w:val="0"/>
-          <w:numId w:val="1002"/>
+          <w:numId w:val="1003"/>
         </w:numPr>
       </w:pPr>
       <w:r>
@@ -474,7 +522,7 @@
         <w:pStyle w:val="Compact"/>
         <w:numPr>
           <w:ilvl w:val="0"/>
-          <w:numId w:val="1002"/>
+          <w:numId w:val="1003"/>
         </w:numPr>
       </w:pPr>
       <w:r>
@@ -505,7 +553,7 @@
         <w:pStyle w:val="Compact"/>
         <w:numPr>
           <w:ilvl w:val="0"/>
-          <w:numId w:val="1002"/>
+          <w:numId w:val="1003"/>
         </w:numPr>
       </w:pPr>
       <w:r>
@@ -536,7 +584,7 @@
         <w:pStyle w:val="Compact"/>
         <w:numPr>
           <w:ilvl w:val="0"/>
-          <w:numId w:val="1002"/>
+          <w:numId w:val="1003"/>
         </w:numPr>
       </w:pPr>
       <w:r>
@@ -661,7 +709,7 @@
         <w:pStyle w:val="Compact"/>
         <w:numPr>
           <w:ilvl w:val="0"/>
-          <w:numId w:val="1003"/>
+          <w:numId w:val="1004"/>
         </w:numPr>
       </w:pPr>
       <w:r>
@@ -683,7 +731,7 @@
         <w:pStyle w:val="Compact"/>
         <w:numPr>
           <w:ilvl w:val="0"/>
-          <w:numId w:val="1003"/>
+          <w:numId w:val="1004"/>
         </w:numPr>
       </w:pPr>
       <w:r>
@@ -705,7 +753,7 @@
         <w:pStyle w:val="Compact"/>
         <w:numPr>
           <w:ilvl w:val="0"/>
-          <w:numId w:val="1003"/>
+          <w:numId w:val="1004"/>
         </w:numPr>
       </w:pPr>
       <w:r>
@@ -727,7 +775,7 @@
         <w:pStyle w:val="Compact"/>
         <w:numPr>
           <w:ilvl w:val="0"/>
-          <w:numId w:val="1003"/>
+          <w:numId w:val="1004"/>
         </w:numPr>
       </w:pPr>
       <w:r>
@@ -749,7 +797,7 @@
         <w:pStyle w:val="Compact"/>
         <w:numPr>
           <w:ilvl w:val="0"/>
-          <w:numId w:val="1003"/>
+          <w:numId w:val="1004"/>
         </w:numPr>
       </w:pPr>
       <w:r>
@@ -771,7 +819,7 @@
         <w:pStyle w:val="Compact"/>
         <w:numPr>
           <w:ilvl w:val="0"/>
-          <w:numId w:val="1003"/>
+          <w:numId w:val="1004"/>
         </w:numPr>
       </w:pPr>
       <w:r>
@@ -793,7 +841,7 @@
         <w:pStyle w:val="Compact"/>
         <w:numPr>
           <w:ilvl w:val="0"/>
-          <w:numId w:val="1003"/>
+          <w:numId w:val="1004"/>
         </w:numPr>
       </w:pPr>
       <w:r>
@@ -1111,7 +1159,7 @@
         <w:pStyle w:val="Compact"/>
         <w:numPr>
           <w:ilvl w:val="0"/>
-          <w:numId w:val="1004"/>
+          <w:numId w:val="1005"/>
         </w:numPr>
       </w:pPr>
       <w:r>
@@ -1123,7 +1171,7 @@
         <w:pStyle w:val="Compact"/>
         <w:numPr>
           <w:ilvl w:val="0"/>
-          <w:numId w:val="1004"/>
+          <w:numId w:val="1005"/>
         </w:numPr>
       </w:pPr>
       <w:r>
@@ -1135,7 +1183,7 @@
         <w:pStyle w:val="Compact"/>
         <w:numPr>
           <w:ilvl w:val="0"/>
-          <w:numId w:val="1004"/>
+          <w:numId w:val="1005"/>
         </w:numPr>
       </w:pPr>
       <w:r>
@@ -1147,7 +1195,7 @@
         <w:pStyle w:val="Compact"/>
         <w:numPr>
           <w:ilvl w:val="0"/>
-          <w:numId w:val="1004"/>
+          <w:numId w:val="1005"/>
         </w:numPr>
       </w:pPr>
       <w:r>
@@ -1159,7 +1207,7 @@
         <w:pStyle w:val="Compact"/>
         <w:numPr>
           <w:ilvl w:val="0"/>
-          <w:numId w:val="1004"/>
+          <w:numId w:val="1005"/>
         </w:numPr>
       </w:pPr>
       <w:r>
@@ -1198,7 +1246,7 @@
         <w:pStyle w:val="Compact"/>
         <w:numPr>
           <w:ilvl w:val="0"/>
-          <w:numId w:val="1005"/>
+          <w:numId w:val="1006"/>
         </w:numPr>
       </w:pPr>
       <w:r>
@@ -1210,7 +1258,7 @@
         <w:pStyle w:val="Compact"/>
         <w:numPr>
           <w:ilvl w:val="0"/>
-          <w:numId w:val="1005"/>
+          <w:numId w:val="1006"/>
         </w:numPr>
       </w:pPr>
       <w:r>
@@ -1222,7 +1270,7 @@
         <w:pStyle w:val="Compact"/>
         <w:numPr>
           <w:ilvl w:val="0"/>
-          <w:numId w:val="1005"/>
+          <w:numId w:val="1006"/>
         </w:numPr>
       </w:pPr>
       <w:r>
@@ -1247,7 +1295,7 @@
         <w:pStyle w:val="Compact"/>
         <w:numPr>
           <w:ilvl w:val="0"/>
-          <w:numId w:val="1005"/>
+          <w:numId w:val="1006"/>
         </w:numPr>
       </w:pPr>
       <w:r>
@@ -1275,7 +1323,7 @@
         <w:pStyle w:val="Compact"/>
         <w:numPr>
           <w:ilvl w:val="0"/>
-          <w:numId w:val="1005"/>
+          <w:numId w:val="1006"/>
         </w:numPr>
       </w:pPr>
       <w:r>
@@ -1303,7 +1351,7 @@
         <w:pStyle w:val="Compact"/>
         <w:numPr>
           <w:ilvl w:val="0"/>
-          <w:numId w:val="1005"/>
+          <w:numId w:val="1006"/>
         </w:numPr>
       </w:pPr>
       <w:r>
@@ -1327,7 +1375,7 @@
         <w:pStyle w:val="Compact"/>
         <w:numPr>
           <w:ilvl w:val="0"/>
-          <w:numId w:val="1005"/>
+          <w:numId w:val="1006"/>
         </w:numPr>
       </w:pPr>
       <w:r>
@@ -1352,7 +1400,7 @@
         <w:pStyle w:val="Compact"/>
         <w:numPr>
           <w:ilvl w:val="0"/>
-          <w:numId w:val="1005"/>
+          <w:numId w:val="1006"/>
         </w:numPr>
       </w:pPr>
       <w:r>
@@ -1526,7 +1574,7 @@
         <w:pStyle w:val="Compact"/>
         <w:numPr>
           <w:ilvl w:val="0"/>
-          <w:numId w:val="1006"/>
+          <w:numId w:val="1007"/>
         </w:numPr>
       </w:pPr>
       <w:r>
@@ -1538,7 +1586,7 @@
         <w:pStyle w:val="Compact"/>
         <w:numPr>
           <w:ilvl w:val="0"/>
-          <w:numId w:val="1006"/>
+          <w:numId w:val="1007"/>
         </w:numPr>
       </w:pPr>
       <w:r>
@@ -1550,7 +1598,7 @@
         <w:pStyle w:val="Compact"/>
         <w:numPr>
           <w:ilvl w:val="0"/>
-          <w:numId w:val="1006"/>
+          <w:numId w:val="1007"/>
         </w:numPr>
       </w:pPr>
       <w:r>
@@ -1572,7 +1620,7 @@
         <w:pStyle w:val="Compact"/>
         <w:numPr>
           <w:ilvl w:val="0"/>
-          <w:numId w:val="1007"/>
+          <w:numId w:val="1008"/>
         </w:numPr>
       </w:pPr>
       <w:r>
@@ -1584,7 +1632,7 @@
         <w:pStyle w:val="Compact"/>
         <w:numPr>
           <w:ilvl w:val="0"/>
-          <w:numId w:val="1007"/>
+          <w:numId w:val="1008"/>
         </w:numPr>
       </w:pPr>
       <w:r>
@@ -1596,7 +1644,7 @@
         <w:pStyle w:val="Compact"/>
         <w:numPr>
           <w:ilvl w:val="0"/>
-          <w:numId w:val="1007"/>
+          <w:numId w:val="1008"/>
         </w:numPr>
       </w:pPr>
       <w:r>
@@ -1608,7 +1656,7 @@
         <w:pStyle w:val="Compact"/>
         <w:numPr>
           <w:ilvl w:val="0"/>
-          <w:numId w:val="1007"/>
+          <w:numId w:val="1008"/>
         </w:numPr>
       </w:pPr>
       <w:r>
@@ -1739,7 +1787,7 @@
         <w:pStyle w:val="Compact"/>
         <w:numPr>
           <w:ilvl w:val="0"/>
-          <w:numId w:val="1008"/>
+          <w:numId w:val="1009"/>
         </w:numPr>
       </w:pPr>
       <w:r>
@@ -1751,7 +1799,7 @@
         <w:pStyle w:val="Compact"/>
         <w:numPr>
           <w:ilvl w:val="0"/>
-          <w:numId w:val="1008"/>
+          <w:numId w:val="1009"/>
         </w:numPr>
       </w:pPr>
       <w:r>
@@ -1811,7 +1859,7 @@
         <w:pStyle w:val="Compact"/>
         <w:numPr>
           <w:ilvl w:val="0"/>
-          <w:numId w:val="1009"/>
+          <w:numId w:val="1010"/>
         </w:numPr>
       </w:pPr>
       <w:r>
@@ -1823,7 +1871,7 @@
         <w:pStyle w:val="Compact"/>
         <w:numPr>
           <w:ilvl w:val="0"/>
-          <w:numId w:val="1009"/>
+          <w:numId w:val="1010"/>
         </w:numPr>
       </w:pPr>
       <w:r>
@@ -1835,7 +1883,7 @@
         <w:pStyle w:val="Compact"/>
         <w:numPr>
           <w:ilvl w:val="0"/>
-          <w:numId w:val="1009"/>
+          <w:numId w:val="1010"/>
         </w:numPr>
       </w:pPr>
       <w:r>
@@ -1847,7 +1895,7 @@
         <w:pStyle w:val="Compact"/>
         <w:numPr>
           <w:ilvl w:val="0"/>
-          <w:numId w:val="1009"/>
+          <w:numId w:val="1010"/>
         </w:numPr>
       </w:pPr>
       <w:r>
@@ -1875,7 +1923,7 @@
         <w:pStyle w:val="Compact"/>
         <w:numPr>
           <w:ilvl w:val="0"/>
-          <w:numId w:val="1009"/>
+          <w:numId w:val="1010"/>
         </w:numPr>
       </w:pPr>
       <w:r>
@@ -1897,7 +1945,7 @@
         <w:pStyle w:val="Compact"/>
         <w:numPr>
           <w:ilvl w:val="0"/>
-          <w:numId w:val="1010"/>
+          <w:numId w:val="1011"/>
         </w:numPr>
       </w:pPr>
       <w:r>
@@ -1909,7 +1957,7 @@
         <w:pStyle w:val="Compact"/>
         <w:numPr>
           <w:ilvl w:val="0"/>
-          <w:numId w:val="1010"/>
+          <w:numId w:val="1011"/>
         </w:numPr>
       </w:pPr>
       <w:r>
@@ -2074,7 +2122,7 @@
         <w:pStyle w:val="Compact"/>
         <w:numPr>
           <w:ilvl w:val="0"/>
-          <w:numId w:val="1011"/>
+          <w:numId w:val="1012"/>
         </w:numPr>
       </w:pPr>
       <w:r>
@@ -2086,7 +2134,7 @@
         <w:pStyle w:val="Compact"/>
         <w:numPr>
           <w:ilvl w:val="0"/>
-          <w:numId w:val="1011"/>
+          <w:numId w:val="1012"/>
         </w:numPr>
       </w:pPr>
       <w:r>
@@ -2098,7 +2146,7 @@
         <w:pStyle w:val="Compact"/>
         <w:numPr>
           <w:ilvl w:val="0"/>
-          <w:numId w:val="1011"/>
+          <w:numId w:val="1012"/>
         </w:numPr>
       </w:pPr>
       <w:r>
@@ -2145,7 +2193,7 @@
         <w:pStyle w:val="Compact"/>
         <w:numPr>
           <w:ilvl w:val="0"/>
-          <w:numId w:val="1012"/>
+          <w:numId w:val="1013"/>
         </w:numPr>
       </w:pPr>
       <w:r>
@@ -2167,7 +2215,7 @@
         <w:pStyle w:val="Compact"/>
         <w:numPr>
           <w:ilvl w:val="0"/>
-          <w:numId w:val="1012"/>
+          <w:numId w:val="1013"/>
         </w:numPr>
       </w:pPr>
       <w:r>
@@ -2189,7 +2237,7 @@
         <w:pStyle w:val="Compact"/>
         <w:numPr>
           <w:ilvl w:val="0"/>
-          <w:numId w:val="1012"/>
+          <w:numId w:val="1013"/>
         </w:numPr>
       </w:pPr>
       <w:r>
@@ -2211,7 +2259,7 @@
         <w:pStyle w:val="Compact"/>
         <w:numPr>
           <w:ilvl w:val="0"/>
-          <w:numId w:val="1012"/>
+          <w:numId w:val="1013"/>
         </w:numPr>
       </w:pPr>
       <w:r>
@@ -2233,7 +2281,7 @@
         <w:pStyle w:val="Compact"/>
         <w:numPr>
           <w:ilvl w:val="0"/>
-          <w:numId w:val="1012"/>
+          <w:numId w:val="1013"/>
         </w:numPr>
       </w:pPr>
       <w:r>
@@ -2265,7 +2313,7 @@
         <w:pStyle w:val="Compact"/>
         <w:numPr>
           <w:ilvl w:val="0"/>
-          <w:numId w:val="1013"/>
+          <w:numId w:val="1014"/>
         </w:numPr>
       </w:pPr>
       <w:r>
@@ -2277,7 +2325,7 @@
         <w:pStyle w:val="Compact"/>
         <w:numPr>
           <w:ilvl w:val="0"/>
-          <w:numId w:val="1013"/>
+          <w:numId w:val="1014"/>
         </w:numPr>
       </w:pPr>
       <w:r>
@@ -2289,7 +2337,7 @@
         <w:pStyle w:val="Compact"/>
         <w:numPr>
           <w:ilvl w:val="0"/>
-          <w:numId w:val="1013"/>
+          <w:numId w:val="1014"/>
         </w:numPr>
       </w:pPr>
       <w:r>
@@ -2301,7 +2349,7 @@
         <w:pStyle w:val="Compact"/>
         <w:numPr>
           <w:ilvl w:val="0"/>
-          <w:numId w:val="1013"/>
+          <w:numId w:val="1014"/>
         </w:numPr>
       </w:pPr>
       <w:r>
@@ -2340,7 +2388,7 @@
       <w:pPr>
         <w:numPr>
           <w:ilvl w:val="0"/>
-          <w:numId w:val="1014"/>
+          <w:numId w:val="1015"/>
         </w:numPr>
       </w:pPr>
       <w:r>
@@ -2351,7 +2399,7 @@
       <w:pPr>
         <w:numPr>
           <w:ilvl w:val="0"/>
-          <w:numId w:val="1014"/>
+          <w:numId w:val="1015"/>
         </w:numPr>
       </w:pPr>
       <w:r>
@@ -2362,7 +2410,7 @@
       <w:pPr>
         <w:numPr>
           <w:ilvl w:val="0"/>
-          <w:numId w:val="1014"/>
+          <w:numId w:val="1015"/>
         </w:numPr>
       </w:pPr>
       <w:r>
@@ -2373,7 +2421,7 @@
       <w:pPr>
         <w:numPr>
           <w:ilvl w:val="0"/>
-          <w:numId w:val="1014"/>
+          <w:numId w:val="1015"/>
         </w:numPr>
       </w:pPr>
       <w:r>
@@ -2384,7 +2432,7 @@
       <w:pPr>
         <w:numPr>
           <w:ilvl w:val="0"/>
-          <w:numId w:val="1014"/>
+          <w:numId w:val="1015"/>
         </w:numPr>
       </w:pPr>
       <w:r>
@@ -2395,7 +2443,7 @@
       <w:pPr>
         <w:numPr>
           <w:ilvl w:val="0"/>
-          <w:numId w:val="1014"/>
+          <w:numId w:val="1015"/>
         </w:numPr>
       </w:pPr>
       <w:r>
@@ -2416,7 +2464,7 @@
       <w:pPr>
         <w:numPr>
           <w:ilvl w:val="0"/>
-          <w:numId w:val="1015"/>
+          <w:numId w:val="1016"/>
         </w:numPr>
       </w:pPr>
       <w:r>
@@ -2427,7 +2475,7 @@
       <w:pPr>
         <w:numPr>
           <w:ilvl w:val="0"/>
-          <w:numId w:val="1015"/>
+          <w:numId w:val="1016"/>
         </w:numPr>
       </w:pPr>
       <w:r>
@@ -2438,7 +2486,7 @@
       <w:pPr>
         <w:numPr>
           <w:ilvl w:val="0"/>
-          <w:numId w:val="1015"/>
+          <w:numId w:val="1016"/>
         </w:numPr>
       </w:pPr>
       <w:r>
@@ -2449,7 +2497,7 @@
       <w:pPr>
         <w:numPr>
           <w:ilvl w:val="0"/>
-          <w:numId w:val="1015"/>
+          <w:numId w:val="1016"/>
         </w:numPr>
       </w:pPr>
       <w:r>
@@ -2460,7 +2508,7 @@
       <w:pPr>
         <w:numPr>
           <w:ilvl w:val="0"/>
-          <w:numId w:val="1015"/>
+          <w:numId w:val="1016"/>
         </w:numPr>
       </w:pPr>
       <w:r>
@@ -2471,7 +2519,7 @@
       <w:pPr>
         <w:numPr>
           <w:ilvl w:val="0"/>
-          <w:numId w:val="1015"/>
+          <w:numId w:val="1016"/>
         </w:numPr>
       </w:pPr>
       <w:r>
@@ -2492,7 +2540,7 @@
       <w:pPr>
         <w:numPr>
           <w:ilvl w:val="0"/>
-          <w:numId w:val="1016"/>
+          <w:numId w:val="1017"/>
         </w:numPr>
       </w:pPr>
       <w:r>
@@ -2503,7 +2551,7 @@
       <w:pPr>
         <w:numPr>
           <w:ilvl w:val="0"/>
-          <w:numId w:val="1016"/>
+          <w:numId w:val="1017"/>
         </w:numPr>
       </w:pPr>
       <w:r>
@@ -2514,7 +2562,7 @@
       <w:pPr>
         <w:numPr>
           <w:ilvl w:val="0"/>
-          <w:numId w:val="1016"/>
+          <w:numId w:val="1017"/>
         </w:numPr>
       </w:pPr>
       <w:r>
@@ -2525,7 +2573,7 @@
       <w:pPr>
         <w:numPr>
           <w:ilvl w:val="0"/>
-          <w:numId w:val="1016"/>
+          <w:numId w:val="1017"/>
         </w:numPr>
       </w:pPr>
       <w:r>
@@ -2546,7 +2594,7 @@
       <w:pPr>
         <w:numPr>
           <w:ilvl w:val="0"/>
-          <w:numId w:val="1017"/>
+          <w:numId w:val="1018"/>
         </w:numPr>
       </w:pPr>
       <w:r>
@@ -2557,7 +2605,7 @@
       <w:pPr>
         <w:numPr>
           <w:ilvl w:val="0"/>
-          <w:numId w:val="1017"/>
+          <w:numId w:val="1018"/>
         </w:numPr>
       </w:pPr>
       <w:r>
@@ -2568,7 +2616,7 @@
       <w:pPr>
         <w:numPr>
           <w:ilvl w:val="0"/>
-          <w:numId w:val="1017"/>
+          <w:numId w:val="1018"/>
         </w:numPr>
       </w:pPr>
       <w:r>
@@ -2589,7 +2637,7 @@
       <w:pPr>
         <w:numPr>
           <w:ilvl w:val="0"/>
-          <w:numId w:val="1018"/>
+          <w:numId w:val="1019"/>
         </w:numPr>
       </w:pPr>
       <w:r>
@@ -2600,7 +2648,7 @@
       <w:pPr>
         <w:numPr>
           <w:ilvl w:val="0"/>
-          <w:numId w:val="1018"/>
+          <w:numId w:val="1019"/>
         </w:numPr>
       </w:pPr>
       <w:r>
@@ -2611,7 +2659,7 @@
       <w:pPr>
         <w:numPr>
           <w:ilvl w:val="0"/>
-          <w:numId w:val="1018"/>
+          <w:numId w:val="1019"/>
         </w:numPr>
       </w:pPr>
       <w:r>
@@ -2632,7 +2680,7 @@
       <w:pPr>
         <w:numPr>
           <w:ilvl w:val="0"/>
-          <w:numId w:val="1019"/>
+          <w:numId w:val="1020"/>
         </w:numPr>
       </w:pPr>
       <w:r>
@@ -2643,7 +2691,7 @@
       <w:pPr>
         <w:numPr>
           <w:ilvl w:val="0"/>
-          <w:numId w:val="1019"/>
+          <w:numId w:val="1020"/>
         </w:numPr>
       </w:pPr>
       <w:r>
@@ -2654,7 +2702,7 @@
       <w:pPr>
         <w:numPr>
           <w:ilvl w:val="0"/>
-          <w:numId w:val="1019"/>
+          <w:numId w:val="1020"/>
         </w:numPr>
       </w:pPr>
       <w:r>
@@ -2665,7 +2713,7 @@
       <w:pPr>
         <w:numPr>
           <w:ilvl w:val="0"/>
-          <w:numId w:val="1019"/>
+          <w:numId w:val="1020"/>
         </w:numPr>
       </w:pPr>
       <w:r>
@@ -2676,7 +2724,7 @@
       <w:pPr>
         <w:numPr>
           <w:ilvl w:val="0"/>
-          <w:numId w:val="1019"/>
+          <w:numId w:val="1020"/>
         </w:numPr>
       </w:pPr>
       <w:r>
@@ -2687,7 +2735,7 @@
       <w:pPr>
         <w:numPr>
           <w:ilvl w:val="0"/>
-          <w:numId w:val="1019"/>
+          <w:numId w:val="1020"/>
         </w:numPr>
       </w:pPr>
       <w:r>
@@ -2717,7 +2765,7 @@
         <w:pStyle w:val="Compact"/>
         <w:numPr>
           <w:ilvl w:val="0"/>
-          <w:numId w:val="1020"/>
+          <w:numId w:val="1021"/>
         </w:numPr>
       </w:pPr>
       <w:r>
@@ -2729,7 +2777,7 @@
         <w:pStyle w:val="Compact"/>
         <w:numPr>
           <w:ilvl w:val="0"/>
-          <w:numId w:val="1020"/>
+          <w:numId w:val="1021"/>
         </w:numPr>
       </w:pPr>
       <w:r>
@@ -2741,7 +2789,7 @@
         <w:pStyle w:val="Compact"/>
         <w:numPr>
           <w:ilvl w:val="0"/>
-          <w:numId w:val="1020"/>
+          <w:numId w:val="1021"/>
         </w:numPr>
       </w:pPr>
       <w:r>
@@ -2753,7 +2801,7 @@
         <w:pStyle w:val="Compact"/>
         <w:numPr>
           <w:ilvl w:val="0"/>
-          <w:numId w:val="1020"/>
+          <w:numId w:val="1021"/>
         </w:numPr>
       </w:pPr>
       <w:r>
@@ -2765,7 +2813,7 @@
         <w:pStyle w:val="Compact"/>
         <w:numPr>
           <w:ilvl w:val="0"/>
-          <w:numId w:val="1020"/>
+          <w:numId w:val="1021"/>
         </w:numPr>
       </w:pPr>
       <w:r>
@@ -2777,7 +2825,7 @@
         <w:pStyle w:val="Compact"/>
         <w:numPr>
           <w:ilvl w:val="0"/>
-          <w:numId w:val="1020"/>
+          <w:numId w:val="1021"/>
         </w:numPr>
       </w:pPr>
       <w:r>
@@ -2789,7 +2837,7 @@
         <w:pStyle w:val="Compact"/>
         <w:numPr>
           <w:ilvl w:val="0"/>
-          <w:numId w:val="1020"/>
+          <w:numId w:val="1021"/>
         </w:numPr>
       </w:pPr>
       <w:r>
@@ -2801,7 +2849,7 @@
         <w:pStyle w:val="Compact"/>
         <w:numPr>
           <w:ilvl w:val="0"/>
-          <w:numId w:val="1020"/>
+          <w:numId w:val="1021"/>
         </w:numPr>
       </w:pPr>
       <w:r>
@@ -2813,7 +2861,7 @@
         <w:pStyle w:val="Compact"/>
         <w:numPr>
           <w:ilvl w:val="0"/>
-          <w:numId w:val="1020"/>
+          <w:numId w:val="1021"/>
         </w:numPr>
       </w:pPr>
       <w:r>
@@ -2982,91 +3030,6 @@
       </w:pPr>
     </w:lvl>
   </w:abstractNum>
-  <w:abstractNum w:abstractNumId="99411">
-    <w:nsid w:val="00A99411"/>
-    <w:multiLevelType w:val="multilevel"/>
-    <w:lvl w:ilvl="0">
-      <w:start w:val="1"/>
-      <w:numFmt w:val="decimal"/>
-      <w:lvlText w:val="%1."/>
-      <w:lvlJc w:val="left"/>
-      <w:pPr>
-        <w:ind w:left="720" w:hanging="360"/>
-      </w:pPr>
-    </w:lvl>
-    <w:lvl w:ilvl="1">
-      <w:start w:val="1"/>
-      <w:numFmt w:val="decimal"/>
-      <w:lvlText w:val="%2."/>
-      <w:lvlJc w:val="left"/>
-      <w:pPr>
-        <w:ind w:left="1440" w:hanging="360"/>
-      </w:pPr>
-    </w:lvl>
-    <w:lvl w:ilvl="2">
-      <w:start w:val="1"/>
-      <w:numFmt w:val="decimal"/>
-      <w:lvlText w:val="%3."/>
-      <w:lvlJc w:val="left"/>
-      <w:pPr>
-        <w:ind w:left="2160" w:hanging="360"/>
-      </w:pPr>
-    </w:lvl>
-    <w:lvl w:ilvl="3">
-      <w:start w:val="1"/>
-      <w:numFmt w:val="decimal"/>
-      <w:lvlText w:val="%4."/>
-      <w:lvlJc w:val="left"/>
-      <w:pPr>
-        <w:ind w:left="2880" w:hanging="360"/>
-      </w:pPr>
-    </w:lvl>
-    <w:lvl w:ilvl="4">
-      <w:start w:val="1"/>
-      <w:numFmt w:val="decimal"/>
-      <w:lvlText w:val="%5."/>
-      <w:lvlJc w:val="left"/>
-      <w:pPr>
-        <w:ind w:left="3600" w:hanging="360"/>
-      </w:pPr>
-    </w:lvl>
-    <w:lvl w:ilvl="5">
-      <w:start w:val="1"/>
-      <w:numFmt w:val="decimal"/>
-      <w:lvlText w:val="%6."/>
-      <w:lvlJc w:val="left"/>
-      <w:pPr>
-        <w:ind w:left="4320" w:hanging="360"/>
-      </w:pPr>
-    </w:lvl>
-    <w:lvl w:ilvl="6">
-      <w:start w:val="1"/>
-      <w:numFmt w:val="decimal"/>
-      <w:lvlText w:val="%7."/>
-      <w:lvlJc w:val="left"/>
-      <w:pPr>
-        <w:ind w:left="5040" w:hanging="360"/>
-      </w:pPr>
-    </w:lvl>
-    <w:lvl w:ilvl="7">
-      <w:start w:val="1"/>
-      <w:numFmt w:val="decimal"/>
-      <w:lvlText w:val="%8."/>
-      <w:lvlJc w:val="left"/>
-      <w:pPr>
-        <w:ind w:left="5760" w:hanging="360"/>
-      </w:pPr>
-    </w:lvl>
-    <w:lvl w:ilvl="8">
-      <w:start w:val="1"/>
-      <w:numFmt w:val="decimal"/>
-      <w:lvlText w:val="%9."/>
-      <w:lvlJc w:val="left"/>
-      <w:pPr>
-        <w:ind w:left="6480" w:hanging="360"/>
-      </w:pPr>
-    </w:lvl>
-  </w:abstractNum>
   <w:abstractNum w:abstractNumId="991">
     <w:nsid w:val="0000A991"/>
     <w:multiLevelType w:val="multilevel"/>
@@ -3170,6 +3133,91 @@
       </w:rPr>
     </w:lvl>
   </w:abstractNum>
+  <w:abstractNum w:abstractNumId="99411">
+    <w:nsid w:val="00A99411"/>
+    <w:multiLevelType w:val="multilevel"/>
+    <w:lvl w:ilvl="0">
+      <w:start w:val="1"/>
+      <w:numFmt w:val="decimal"/>
+      <w:lvlText w:val="%1."/>
+      <w:lvlJc w:val="left"/>
+      <w:pPr>
+        <w:ind w:left="720" w:hanging="360"/>
+      </w:pPr>
+    </w:lvl>
+    <w:lvl w:ilvl="1">
+      <w:start w:val="1"/>
+      <w:numFmt w:val="decimal"/>
+      <w:lvlText w:val="%2."/>
+      <w:lvlJc w:val="left"/>
+      <w:pPr>
+        <w:ind w:left="1440" w:hanging="360"/>
+      </w:pPr>
+    </w:lvl>
+    <w:lvl w:ilvl="2">
+      <w:start w:val="1"/>
+      <w:numFmt w:val="decimal"/>
+      <w:lvlText w:val="%3."/>
+      <w:lvlJc w:val="left"/>
+      <w:pPr>
+        <w:ind w:left="2160" w:hanging="360"/>
+      </w:pPr>
+    </w:lvl>
+    <w:lvl w:ilvl="3">
+      <w:start w:val="1"/>
+      <w:numFmt w:val="decimal"/>
+      <w:lvlText w:val="%4."/>
+      <w:lvlJc w:val="left"/>
+      <w:pPr>
+        <w:ind w:left="2880" w:hanging="360"/>
+      </w:pPr>
+    </w:lvl>
+    <w:lvl w:ilvl="4">
+      <w:start w:val="1"/>
+      <w:numFmt w:val="decimal"/>
+      <w:lvlText w:val="%5."/>
+      <w:lvlJc w:val="left"/>
+      <w:pPr>
+        <w:ind w:left="3600" w:hanging="360"/>
+      </w:pPr>
+    </w:lvl>
+    <w:lvl w:ilvl="5">
+      <w:start w:val="1"/>
+      <w:numFmt w:val="decimal"/>
+      <w:lvlText w:val="%6."/>
+      <w:lvlJc w:val="left"/>
+      <w:pPr>
+        <w:ind w:left="4320" w:hanging="360"/>
+      </w:pPr>
+    </w:lvl>
+    <w:lvl w:ilvl="6">
+      <w:start w:val="1"/>
+      <w:numFmt w:val="decimal"/>
+      <w:lvlText w:val="%7."/>
+      <w:lvlJc w:val="left"/>
+      <w:pPr>
+        <w:ind w:left="5040" w:hanging="360"/>
+      </w:pPr>
+    </w:lvl>
+    <w:lvl w:ilvl="7">
+      <w:start w:val="1"/>
+      <w:numFmt w:val="decimal"/>
+      <w:lvlText w:val="%8."/>
+      <w:lvlJc w:val="left"/>
+      <w:pPr>
+        <w:ind w:left="5760" w:hanging="360"/>
+      </w:pPr>
+    </w:lvl>
+    <w:lvl w:ilvl="8">
+      <w:start w:val="1"/>
+      <w:numFmt w:val="decimal"/>
+      <w:lvlText w:val="%9."/>
+      <w:lvlJc w:val="left"/>
+      <w:pPr>
+        <w:ind w:left="6480" w:hanging="360"/>
+      </w:pPr>
+    </w:lvl>
+  </w:abstractNum>
   <w:abstractNum w:abstractNumId="99417">
     <w:nsid w:val="00A99417"/>
     <w:multiLevelType w:val="multilevel"/>
@@ -3599,6 +3647,9 @@
     <w:abstractNumId w:val="990"/>
   </w:num>
   <w:num w:numId="1001">
+    <w:abstractNumId w:val="991"/>
+  </w:num>
+  <w:num w:numId="1002">
     <w:abstractNumId w:val="99411"/>
     <w:lvlOverride w:ilvl="0">
       <w:startOverride w:val="1"/>
@@ -3627,9 +3678,6 @@
     <w:lvlOverride w:ilvl="8">
       <w:startOverride w:val="1"/>
     </w:lvlOverride>
-  </w:num>
-  <w:num w:numId="1002">
-    <w:abstractNumId w:val="991"/>
   </w:num>
   <w:num w:numId="1003">
     <w:abstractNumId w:val="991"/>
@@ -3650,6 +3698,9 @@
     <w:abstractNumId w:val="991"/>
   </w:num>
   <w:num w:numId="1009">
+    <w:abstractNumId w:val="991"/>
+  </w:num>
+  <w:num w:numId="1010">
     <w:abstractNumId w:val="99411"/>
     <w:lvlOverride w:ilvl="0">
       <w:startOverride w:val="1"/>
@@ -3678,14 +3729,14 @@
     <w:lvlOverride w:ilvl="8">
       <w:startOverride w:val="1"/>
     </w:lvlOverride>
-  </w:num>
-  <w:num w:numId="1010">
-    <w:abstractNumId w:val="991"/>
   </w:num>
   <w:num w:numId="1011">
     <w:abstractNumId w:val="991"/>
   </w:num>
   <w:num w:numId="1012">
+    <w:abstractNumId w:val="991"/>
+  </w:num>
+  <w:num w:numId="1013">
     <w:abstractNumId w:val="99411"/>
     <w:lvlOverride w:ilvl="0">
       <w:startOverride w:val="1"/>
@@ -3715,10 +3766,10 @@
       <w:startOverride w:val="1"/>
     </w:lvlOverride>
   </w:num>
-  <w:num w:numId="1013">
+  <w:num w:numId="1014">
     <w:abstractNumId w:val="991"/>
   </w:num>
-  <w:num w:numId="1014">
+  <w:num w:numId="1015">
     <w:abstractNumId w:val="99411"/>
     <w:lvlOverride w:ilvl="0">
       <w:startOverride w:val="1"/>
@@ -3748,7 +3799,7 @@
       <w:startOverride w:val="1"/>
     </w:lvlOverride>
   </w:num>
-  <w:num w:numId="1015">
+  <w:num w:numId="1016">
     <w:abstractNumId w:val="99417"/>
     <w:lvlOverride w:ilvl="0">
       <w:startOverride w:val="7"/>
@@ -3778,7 +3829,7 @@
       <w:startOverride w:val="7"/>
     </w:lvlOverride>
   </w:num>
-  <w:num w:numId="1016">
+  <w:num w:numId="1017">
     <w:abstractNumId w:val="994113"/>
     <w:lvlOverride w:ilvl="0">
       <w:startOverride w:val="13"/>
@@ -3808,7 +3859,7 @@
       <w:startOverride w:val="13"/>
     </w:lvlOverride>
   </w:num>
-  <w:num w:numId="1017">
+  <w:num w:numId="1018">
     <w:abstractNumId w:val="994117"/>
     <w:lvlOverride w:ilvl="0">
       <w:startOverride w:val="17"/>
@@ -3838,7 +3889,7 @@
       <w:startOverride w:val="17"/>
     </w:lvlOverride>
   </w:num>
-  <w:num w:numId="1018">
+  <w:num w:numId="1019">
     <w:abstractNumId w:val="994120"/>
     <w:lvlOverride w:ilvl="0">
       <w:startOverride w:val="20"/>
@@ -3868,7 +3919,7 @@
       <w:startOverride w:val="20"/>
     </w:lvlOverride>
   </w:num>
-  <w:num w:numId="1019">
+  <w:num w:numId="1020">
     <w:abstractNumId w:val="994123"/>
     <w:lvlOverride w:ilvl="0">
       <w:startOverride w:val="23"/>
@@ -3898,7 +3949,7 @@
       <w:startOverride w:val="23"/>
     </w:lvlOverride>
   </w:num>
-  <w:num w:numId="1020">
+  <w:num w:numId="1021">
     <w:abstractNumId w:val="991"/>
   </w:num>
 </w:numbering>

</xml_diff>

<commit_message>
Fix numbered lists also rendering as run-on text in DOCX/PDF output
Same root cause as the prior bullet-list fix, but for ordered lists:
the Population Method (Invention 1), Invention 3, and Invention 5's
numbered steps each immediately followed a "Referring to FIG. X:"
intro sentence with no blank line, merging the list into that sentence
as literal "1. 2. 3." text instead of a real numbered list. Cosmetic
only, same as before, but corrected for a clean record.

Co-Authored-By: Claude Sonnet 5 <noreply@anthropic.com>
</commit_message>
<xml_diff>
--- a/patent_application/non_provisional/submittal_docs/non_provisional_written_description.docx
+++ b/patent_application/non_provisional/submittal_docs/non_provisional_written_description.docx
@@ -883,15 +883,15 @@
       <w:r>
         <w:t xml:space="preserve">Referring to FIG. 1:</w:t>
       </w:r>
-      <w:r>
-        <w:t xml:space="preserve"> </w:t>
-      </w:r>
-      <w:r>
-        <w:t xml:space="preserve">1.</w:t>
-      </w:r>
-      <w:r>
-        <w:t xml:space="preserve"> </w:t>
-      </w:r>
+    </w:p>
+    <w:p>
+      <w:pPr>
+        <w:pStyle w:val="Compact"/>
+        <w:numPr>
+          <w:ilvl w:val="0"/>
+          <w:numId w:val="1005"/>
+        </w:numPr>
+      </w:pPr>
       <w:r>
         <w:rPr>
           <w:b/>
@@ -905,15 +905,15 @@
       <w:r>
         <w:t xml:space="preserve">The course-creation user must first pass through a first AI agent invocation conducting the bounded-turn conversational elicitation of Invention 4, which asks the user questions until the scope of the course is clarified and produces a structured, multi-part course description (the brief). This brief is then passed to a second, separate AI agent invocation — the topic-discovery module (104) below — which generates the course itself.</w:t>
       </w:r>
-      <w:r>
-        <w:t xml:space="preserve"> </w:t>
-      </w:r>
-      <w:r>
-        <w:t xml:space="preserve">2.</w:t>
-      </w:r>
-      <w:r>
-        <w:t xml:space="preserve"> </w:t>
-      </w:r>
+    </w:p>
+    <w:p>
+      <w:pPr>
+        <w:pStyle w:val="Compact"/>
+        <w:numPr>
+          <w:ilvl w:val="0"/>
+          <w:numId w:val="1005"/>
+        </w:numPr>
+      </w:pPr>
       <w:r>
         <w:rPr>
           <w:b/>
@@ -927,15 +927,15 @@
       <w:r>
         <w:t xml:space="preserve">An AI agent is given the option to autonomously perform a bounded number of web searches to gather current, subject-specific background information when its own knowledge confidence is low, producing a research summary used to inform subsequent steps.</w:t>
       </w:r>
-      <w:r>
-        <w:t xml:space="preserve"> </w:t>
-      </w:r>
-      <w:r>
-        <w:t xml:space="preserve">3.</w:t>
-      </w:r>
-      <w:r>
-        <w:t xml:space="preserve"> </w:t>
-      </w:r>
+    </w:p>
+    <w:p>
+      <w:pPr>
+        <w:pStyle w:val="Compact"/>
+        <w:numPr>
+          <w:ilvl w:val="0"/>
+          <w:numId w:val="1005"/>
+        </w:numPr>
+      </w:pPr>
       <w:r>
         <w:rPr>
           <w:b/>
@@ -955,15 +955,15 @@
       <w:r>
         <w:t xml:space="preserve">), to return a set of topic names and short descriptions for the subject. The course-creation user does not specify a depth; instead, the agent infers an appropriate depth tier (e.g., introductory, intermediate, advanced, or an adaptive tier self-determined within a bounded range) directly from the structured course description (the brief of Invention 4), and the number of topics generated follows from that inferred tier.</w:t>
       </w:r>
-      <w:r>
-        <w:t xml:space="preserve"> </w:t>
-      </w:r>
-      <w:r>
-        <w:t xml:space="preserve">4.</w:t>
-      </w:r>
-      <w:r>
-        <w:t xml:space="preserve"> </w:t>
-      </w:r>
+    </w:p>
+    <w:p>
+      <w:pPr>
+        <w:pStyle w:val="Compact"/>
+        <w:numPr>
+          <w:ilvl w:val="0"/>
+          <w:numId w:val="1005"/>
+        </w:numPr>
+      </w:pPr>
       <w:r>
         <w:rPr>
           <w:b/>
@@ -977,15 +977,15 @@
       <w:r>
         <w:t xml:space="preserve">The discovered topic set is presented to a human reviewer through a graphical interface. The reviewer may omit topics, add topics, and confirm the set before any further (and more costly) generation proceeds, looping back to the Topic Discovery module (104) if changes are requested. This checkpoint doubles as the primary completeness/relevance validation gate for the pipeline.</w:t>
       </w:r>
-      <w:r>
-        <w:t xml:space="preserve"> </w:t>
-      </w:r>
-      <w:r>
-        <w:t xml:space="preserve">5.</w:t>
-      </w:r>
-      <w:r>
-        <w:t xml:space="preserve"> </w:t>
-      </w:r>
+    </w:p>
+    <w:p>
+      <w:pPr>
+        <w:pStyle w:val="Compact"/>
+        <w:numPr>
+          <w:ilvl w:val="0"/>
+          <w:numId w:val="1005"/>
+        </w:numPr>
+      </w:pPr>
       <w:r>
         <w:rPr>
           <w:b/>
@@ -999,15 +999,15 @@
       <w:r>
         <w:t xml:space="preserve">For each confirmed topic, the AI agent generates markdown-formatted study content, in batches, with per-topic fallback regeneration on batch failure or truncation.</w:t>
       </w:r>
-      <w:r>
-        <w:t xml:space="preserve"> </w:t>
-      </w:r>
-      <w:r>
-        <w:t xml:space="preserve">6.</w:t>
-      </w:r>
-      <w:r>
-        <w:t xml:space="preserve"> </w:t>
-      </w:r>
+    </w:p>
+    <w:p>
+      <w:pPr>
+        <w:pStyle w:val="Compact"/>
+        <w:numPr>
+          <w:ilvl w:val="0"/>
+          <w:numId w:val="1005"/>
+        </w:numPr>
+      </w:pPr>
       <w:r>
         <w:rPr>
           <w:b/>
@@ -1021,15 +1021,15 @@
       <w:r>
         <w:t xml:space="preserve">For each confirmed topic, a (possibly different, lower-cost) AI agent generates a fixed number of multiple-choice assessment questions, each with an explanation, validated against a fixed schema (exactly one correct option among a fixed number of options).</w:t>
       </w:r>
-      <w:r>
-        <w:t xml:space="preserve"> </w:t>
-      </w:r>
-      <w:r>
-        <w:t xml:space="preserve">7.</w:t>
-      </w:r>
-      <w:r>
-        <w:t xml:space="preserve"> </w:t>
-      </w:r>
+    </w:p>
+    <w:p>
+      <w:pPr>
+        <w:pStyle w:val="Compact"/>
+        <w:numPr>
+          <w:ilvl w:val="0"/>
+          <w:numId w:val="1005"/>
+        </w:numPr>
+      </w:pPr>
       <w:r>
         <w:rPr>
           <w:b/>
@@ -1043,15 +1043,15 @@
       <w:r>
         <w:t xml:space="preserve">Typed, non-prerequisite relationships are generated between topics as described in Invention 3 and FIG. 4.</w:t>
       </w:r>
-      <w:r>
-        <w:t xml:space="preserve"> </w:t>
-      </w:r>
-      <w:r>
-        <w:t xml:space="preserve">8.</w:t>
-      </w:r>
-      <w:r>
-        <w:t xml:space="preserve"> </w:t>
-      </w:r>
+    </w:p>
+    <w:p>
+      <w:pPr>
+        <w:pStyle w:val="Compact"/>
+        <w:numPr>
+          <w:ilvl w:val="0"/>
+          <w:numId w:val="1005"/>
+        </w:numPr>
+      </w:pPr>
       <w:r>
         <w:rPr>
           <w:b/>
@@ -1077,15 +1077,15 @@
       <w:r>
         <w:t xml:space="preserve">of the endpoints — until the prerequisite graph is acyclic. Topics left with no prerequisite edges are then re-examined by the AI agent to confirm they are genuinely foundational, and are re-queried if not.</w:t>
       </w:r>
-      <w:r>
-        <w:t xml:space="preserve"> </w:t>
-      </w:r>
-      <w:r>
-        <w:t xml:space="preserve">9.</w:t>
-      </w:r>
-      <w:r>
-        <w:t xml:space="preserve"> </w:t>
-      </w:r>
+    </w:p>
+    <w:p>
+      <w:pPr>
+        <w:pStyle w:val="Compact"/>
+        <w:numPr>
+          <w:ilvl w:val="0"/>
+          <w:numId w:val="1005"/>
+        </w:numPr>
+      </w:pPr>
       <w:r>
         <w:rPr>
           <w:b/>
@@ -1099,15 +1099,15 @@
       <w:r>
         <w:t xml:space="preserve">A graph-centrality measure (e.g., betweenness centrality) is computed over the prerequisite graph and stored as an importance score on each topic node, for later use in goal-path tie-breaking and recommendation (Invention 2).</w:t>
       </w:r>
-      <w:r>
-        <w:t xml:space="preserve"> </w:t>
-      </w:r>
-      <w:r>
-        <w:t xml:space="preserve">10.</w:t>
-      </w:r>
-      <w:r>
-        <w:t xml:space="preserve"> </w:t>
-      </w:r>
+    </w:p>
+    <w:p>
+      <w:pPr>
+        <w:pStyle w:val="Compact"/>
+        <w:numPr>
+          <w:ilvl w:val="0"/>
+          <w:numId w:val="1005"/>
+        </w:numPr>
+      </w:pPr>
       <w:r>
         <w:rPr>
           <w:b/>
@@ -1121,15 +1121,15 @@
       <w:r>
         <w:t xml:space="preserve">Vector embeddings are generated for topic study content and for the domain’s tagline/summary, for use in semantic search (Invention 5).</w:t>
       </w:r>
-      <w:r>
-        <w:t xml:space="preserve"> </w:t>
-      </w:r>
-      <w:r>
-        <w:t xml:space="preserve">11.</w:t>
-      </w:r>
-      <w:r>
-        <w:t xml:space="preserve"> </w:t>
-      </w:r>
+    </w:p>
+    <w:p>
+      <w:pPr>
+        <w:pStyle w:val="Compact"/>
+        <w:numPr>
+          <w:ilvl w:val="0"/>
+          <w:numId w:val="1005"/>
+        </w:numPr>
+      </w:pPr>
       <w:r>
         <w:rPr>
           <w:b/>
@@ -1159,7 +1159,7 @@
         <w:pStyle w:val="Compact"/>
         <w:numPr>
           <w:ilvl w:val="0"/>
-          <w:numId w:val="1005"/>
+          <w:numId w:val="1006"/>
         </w:numPr>
       </w:pPr>
       <w:r>
@@ -1171,7 +1171,7 @@
         <w:pStyle w:val="Compact"/>
         <w:numPr>
           <w:ilvl w:val="0"/>
-          <w:numId w:val="1005"/>
+          <w:numId w:val="1006"/>
         </w:numPr>
       </w:pPr>
       <w:r>
@@ -1183,7 +1183,7 @@
         <w:pStyle w:val="Compact"/>
         <w:numPr>
           <w:ilvl w:val="0"/>
-          <w:numId w:val="1005"/>
+          <w:numId w:val="1006"/>
         </w:numPr>
       </w:pPr>
       <w:r>
@@ -1195,7 +1195,7 @@
         <w:pStyle w:val="Compact"/>
         <w:numPr>
           <w:ilvl w:val="0"/>
-          <w:numId w:val="1005"/>
+          <w:numId w:val="1006"/>
         </w:numPr>
       </w:pPr>
       <w:r>
@@ -1207,7 +1207,7 @@
         <w:pStyle w:val="Compact"/>
         <w:numPr>
           <w:ilvl w:val="0"/>
-          <w:numId w:val="1005"/>
+          <w:numId w:val="1006"/>
         </w:numPr>
       </w:pPr>
       <w:r>
@@ -1246,7 +1246,7 @@
         <w:pStyle w:val="Compact"/>
         <w:numPr>
           <w:ilvl w:val="0"/>
-          <w:numId w:val="1006"/>
+          <w:numId w:val="1007"/>
         </w:numPr>
       </w:pPr>
       <w:r>
@@ -1258,7 +1258,7 @@
         <w:pStyle w:val="Compact"/>
         <w:numPr>
           <w:ilvl w:val="0"/>
-          <w:numId w:val="1006"/>
+          <w:numId w:val="1007"/>
         </w:numPr>
       </w:pPr>
       <w:r>
@@ -1270,7 +1270,7 @@
         <w:pStyle w:val="Compact"/>
         <w:numPr>
           <w:ilvl w:val="0"/>
-          <w:numId w:val="1006"/>
+          <w:numId w:val="1007"/>
         </w:numPr>
       </w:pPr>
       <w:r>
@@ -1295,7 +1295,7 @@
         <w:pStyle w:val="Compact"/>
         <w:numPr>
           <w:ilvl w:val="0"/>
-          <w:numId w:val="1006"/>
+          <w:numId w:val="1007"/>
         </w:numPr>
       </w:pPr>
       <w:r>
@@ -1323,7 +1323,7 @@
         <w:pStyle w:val="Compact"/>
         <w:numPr>
           <w:ilvl w:val="0"/>
-          <w:numId w:val="1006"/>
+          <w:numId w:val="1007"/>
         </w:numPr>
       </w:pPr>
       <w:r>
@@ -1351,7 +1351,7 @@
         <w:pStyle w:val="Compact"/>
         <w:numPr>
           <w:ilvl w:val="0"/>
-          <w:numId w:val="1006"/>
+          <w:numId w:val="1007"/>
         </w:numPr>
       </w:pPr>
       <w:r>
@@ -1375,7 +1375,7 @@
         <w:pStyle w:val="Compact"/>
         <w:numPr>
           <w:ilvl w:val="0"/>
-          <w:numId w:val="1006"/>
+          <w:numId w:val="1007"/>
         </w:numPr>
       </w:pPr>
       <w:r>
@@ -1400,7 +1400,7 @@
         <w:pStyle w:val="Compact"/>
         <w:numPr>
           <w:ilvl w:val="0"/>
-          <w:numId w:val="1006"/>
+          <w:numId w:val="1007"/>
         </w:numPr>
       </w:pPr>
       <w:r>
@@ -1574,7 +1574,7 @@
         <w:pStyle w:val="Compact"/>
         <w:numPr>
           <w:ilvl w:val="0"/>
-          <w:numId w:val="1007"/>
+          <w:numId w:val="1008"/>
         </w:numPr>
       </w:pPr>
       <w:r>
@@ -1586,7 +1586,7 @@
         <w:pStyle w:val="Compact"/>
         <w:numPr>
           <w:ilvl w:val="0"/>
-          <w:numId w:val="1007"/>
+          <w:numId w:val="1008"/>
         </w:numPr>
       </w:pPr>
       <w:r>
@@ -1598,7 +1598,7 @@
         <w:pStyle w:val="Compact"/>
         <w:numPr>
           <w:ilvl w:val="0"/>
-          <w:numId w:val="1007"/>
+          <w:numId w:val="1008"/>
         </w:numPr>
       </w:pPr>
       <w:r>
@@ -1620,7 +1620,7 @@
         <w:pStyle w:val="Compact"/>
         <w:numPr>
           <w:ilvl w:val="0"/>
-          <w:numId w:val="1008"/>
+          <w:numId w:val="1009"/>
         </w:numPr>
       </w:pPr>
       <w:r>
@@ -1632,7 +1632,7 @@
         <w:pStyle w:val="Compact"/>
         <w:numPr>
           <w:ilvl w:val="0"/>
-          <w:numId w:val="1008"/>
+          <w:numId w:val="1009"/>
         </w:numPr>
       </w:pPr>
       <w:r>
@@ -1644,7 +1644,7 @@
         <w:pStyle w:val="Compact"/>
         <w:numPr>
           <w:ilvl w:val="0"/>
-          <w:numId w:val="1008"/>
+          <w:numId w:val="1009"/>
         </w:numPr>
       </w:pPr>
       <w:r>
@@ -1656,7 +1656,7 @@
         <w:pStyle w:val="Compact"/>
         <w:numPr>
           <w:ilvl w:val="0"/>
-          <w:numId w:val="1008"/>
+          <w:numId w:val="1009"/>
         </w:numPr>
       </w:pPr>
       <w:r>
@@ -1705,15 +1705,15 @@
       <w:r>
         <w:t xml:space="preserve">Referring to FIG. 4:</w:t>
       </w:r>
-      <w:r>
-        <w:t xml:space="preserve"> </w:t>
-      </w:r>
-      <w:r>
-        <w:t xml:space="preserve">1.</w:t>
-      </w:r>
-      <w:r>
-        <w:t xml:space="preserve"> </w:t>
-      </w:r>
+    </w:p>
+    <w:p>
+      <w:pPr>
+        <w:pStyle w:val="Compact"/>
+        <w:numPr>
+          <w:ilvl w:val="0"/>
+          <w:numId w:val="1010"/>
+        </w:numPr>
+      </w:pPr>
       <w:r>
         <w:rPr>
           <w:b/>
@@ -1727,15 +1727,15 @@
       <w:r>
         <w:t xml:space="preserve">An AI agent is queried, given the full corpus of generated study content (400) for a subject, to propose a bounded set of relationship types. Each relationship type comprises a short label and an archetype classification selected from a fixed set (e.g., functional, hierarchical, causal, spatial, temporal, safety, other), producing the relationship-type vocabulary (420).</w:t>
       </w:r>
-      <w:r>
-        <w:t xml:space="preserve"> </w:t>
-      </w:r>
-      <w:r>
-        <w:t xml:space="preserve">2.</w:t>
-      </w:r>
-      <w:r>
-        <w:t xml:space="preserve"> </w:t>
-      </w:r>
+    </w:p>
+    <w:p>
+      <w:pPr>
+        <w:pStyle w:val="Compact"/>
+        <w:numPr>
+          <w:ilvl w:val="0"/>
+          <w:numId w:val="1010"/>
+        </w:numPr>
+      </w:pPr>
       <w:r>
         <w:rPr>
           <w:b/>
@@ -1749,15 +1749,15 @@
       <w:r>
         <w:t xml:space="preserve">The AI agent is queried, in batches, using both the corpus (400) and the generated vocabulary (420), to assign relationship types from the vocabulary between pairs of topics, together with a short natural-language description specific to that pairing.</w:t>
       </w:r>
-      <w:r>
-        <w:t xml:space="preserve"> </w:t>
-      </w:r>
-      <w:r>
-        <w:t xml:space="preserve">3.</w:t>
-      </w:r>
-      <w:r>
-        <w:t xml:space="preserve"> </w:t>
-      </w:r>
+    </w:p>
+    <w:p>
+      <w:pPr>
+        <w:pStyle w:val="Compact"/>
+        <w:numPr>
+          <w:ilvl w:val="0"/>
+          <w:numId w:val="1010"/>
+        </w:numPr>
+      </w:pPr>
       <w:r>
         <w:rPr>
           <w:b/>
@@ -1787,7 +1787,7 @@
         <w:pStyle w:val="Compact"/>
         <w:numPr>
           <w:ilvl w:val="0"/>
-          <w:numId w:val="1009"/>
+          <w:numId w:val="1011"/>
         </w:numPr>
       </w:pPr>
       <w:r>
@@ -1799,7 +1799,7 @@
         <w:pStyle w:val="Compact"/>
         <w:numPr>
           <w:ilvl w:val="0"/>
-          <w:numId w:val="1009"/>
+          <w:numId w:val="1011"/>
         </w:numPr>
       </w:pPr>
       <w:r>
@@ -1859,7 +1859,7 @@
         <w:pStyle w:val="Compact"/>
         <w:numPr>
           <w:ilvl w:val="0"/>
-          <w:numId w:val="1010"/>
+          <w:numId w:val="1012"/>
         </w:numPr>
       </w:pPr>
       <w:r>
@@ -1871,7 +1871,7 @@
         <w:pStyle w:val="Compact"/>
         <w:numPr>
           <w:ilvl w:val="0"/>
-          <w:numId w:val="1010"/>
+          <w:numId w:val="1012"/>
         </w:numPr>
       </w:pPr>
       <w:r>
@@ -1883,7 +1883,7 @@
         <w:pStyle w:val="Compact"/>
         <w:numPr>
           <w:ilvl w:val="0"/>
-          <w:numId w:val="1010"/>
+          <w:numId w:val="1012"/>
         </w:numPr>
       </w:pPr>
       <w:r>
@@ -1895,7 +1895,7 @@
         <w:pStyle w:val="Compact"/>
         <w:numPr>
           <w:ilvl w:val="0"/>
-          <w:numId w:val="1010"/>
+          <w:numId w:val="1012"/>
         </w:numPr>
       </w:pPr>
       <w:r>
@@ -1923,7 +1923,7 @@
         <w:pStyle w:val="Compact"/>
         <w:numPr>
           <w:ilvl w:val="0"/>
-          <w:numId w:val="1010"/>
+          <w:numId w:val="1012"/>
         </w:numPr>
       </w:pPr>
       <w:r>
@@ -1945,7 +1945,7 @@
         <w:pStyle w:val="Compact"/>
         <w:numPr>
           <w:ilvl w:val="0"/>
-          <w:numId w:val="1011"/>
+          <w:numId w:val="1013"/>
         </w:numPr>
       </w:pPr>
       <w:r>
@@ -1957,7 +1957,7 @@
         <w:pStyle w:val="Compact"/>
         <w:numPr>
           <w:ilvl w:val="0"/>
-          <w:numId w:val="1011"/>
+          <w:numId w:val="1013"/>
         </w:numPr>
       </w:pPr>
       <w:r>
@@ -2038,15 +2038,15 @@
       <w:r>
         <w:t xml:space="preserve">Referring to FIG. 5, a search query (500) is passed to a query-embedding generator (510), and then to one of two modes:</w:t>
       </w:r>
-      <w:r>
-        <w:t xml:space="preserve"> </w:t>
-      </w:r>
-      <w:r>
-        <w:t xml:space="preserve">1.</w:t>
-      </w:r>
-      <w:r>
-        <w:t xml:space="preserve"> </w:t>
-      </w:r>
+    </w:p>
+    <w:p>
+      <w:pPr>
+        <w:pStyle w:val="Compact"/>
+        <w:numPr>
+          <w:ilvl w:val="0"/>
+          <w:numId w:val="1014"/>
+        </w:numPr>
+      </w:pPr>
       <w:r>
         <w:rPr>
           <w:b/>
@@ -2060,15 +2060,15 @@
       <w:r>
         <w:t xml:space="preserve">the query embedding is compared against domain-tagline embeddings by a domain comparator (520); results are filtered by a first threshold filter (522).</w:t>
       </w:r>
-      <w:r>
-        <w:t xml:space="preserve"> </w:t>
-      </w:r>
-      <w:r>
-        <w:t xml:space="preserve">2.</w:t>
-      </w:r>
-      <w:r>
-        <w:t xml:space="preserve"> </w:t>
-      </w:r>
+    </w:p>
+    <w:p>
+      <w:pPr>
+        <w:pStyle w:val="Compact"/>
+        <w:numPr>
+          <w:ilvl w:val="0"/>
+          <w:numId w:val="1014"/>
+        </w:numPr>
+      </w:pPr>
       <w:r>
         <w:rPr>
           <w:b/>
@@ -2101,7 +2101,7 @@
     </w:p>
     <w:p>
       <w:pPr>
-        <w:pStyle w:val="BodyText"/>
+        <w:pStyle w:val="FirstParagraph"/>
       </w:pPr>
       <w:r>
         <w:t xml:space="preserve">Both modes converge on a common output of filtered candidate nodes (540) returned in response to the query.</w:t>
@@ -2122,7 +2122,7 @@
         <w:pStyle w:val="Compact"/>
         <w:numPr>
           <w:ilvl w:val="0"/>
-          <w:numId w:val="1012"/>
+          <w:numId w:val="1015"/>
         </w:numPr>
       </w:pPr>
       <w:r>
@@ -2134,7 +2134,7 @@
         <w:pStyle w:val="Compact"/>
         <w:numPr>
           <w:ilvl w:val="0"/>
-          <w:numId w:val="1012"/>
+          <w:numId w:val="1015"/>
         </w:numPr>
       </w:pPr>
       <w:r>
@@ -2146,7 +2146,7 @@
         <w:pStyle w:val="Compact"/>
         <w:numPr>
           <w:ilvl w:val="0"/>
-          <w:numId w:val="1012"/>
+          <w:numId w:val="1015"/>
         </w:numPr>
       </w:pPr>
       <w:r>
@@ -2193,7 +2193,7 @@
         <w:pStyle w:val="Compact"/>
         <w:numPr>
           <w:ilvl w:val="0"/>
-          <w:numId w:val="1013"/>
+          <w:numId w:val="1016"/>
         </w:numPr>
       </w:pPr>
       <w:r>
@@ -2215,7 +2215,7 @@
         <w:pStyle w:val="Compact"/>
         <w:numPr>
           <w:ilvl w:val="0"/>
-          <w:numId w:val="1013"/>
+          <w:numId w:val="1016"/>
         </w:numPr>
       </w:pPr>
       <w:r>
@@ -2237,7 +2237,7 @@
         <w:pStyle w:val="Compact"/>
         <w:numPr>
           <w:ilvl w:val="0"/>
-          <w:numId w:val="1013"/>
+          <w:numId w:val="1016"/>
         </w:numPr>
       </w:pPr>
       <w:r>
@@ -2259,7 +2259,7 @@
         <w:pStyle w:val="Compact"/>
         <w:numPr>
           <w:ilvl w:val="0"/>
-          <w:numId w:val="1013"/>
+          <w:numId w:val="1016"/>
         </w:numPr>
       </w:pPr>
       <w:r>
@@ -2281,7 +2281,7 @@
         <w:pStyle w:val="Compact"/>
         <w:numPr>
           <w:ilvl w:val="0"/>
-          <w:numId w:val="1013"/>
+          <w:numId w:val="1016"/>
         </w:numPr>
       </w:pPr>
       <w:r>
@@ -2313,7 +2313,7 @@
         <w:pStyle w:val="Compact"/>
         <w:numPr>
           <w:ilvl w:val="0"/>
-          <w:numId w:val="1014"/>
+          <w:numId w:val="1017"/>
         </w:numPr>
       </w:pPr>
       <w:r>
@@ -2325,7 +2325,7 @@
         <w:pStyle w:val="Compact"/>
         <w:numPr>
           <w:ilvl w:val="0"/>
-          <w:numId w:val="1014"/>
+          <w:numId w:val="1017"/>
         </w:numPr>
       </w:pPr>
       <w:r>
@@ -2337,7 +2337,7 @@
         <w:pStyle w:val="Compact"/>
         <w:numPr>
           <w:ilvl w:val="0"/>
-          <w:numId w:val="1014"/>
+          <w:numId w:val="1017"/>
         </w:numPr>
       </w:pPr>
       <w:r>
@@ -2349,7 +2349,7 @@
         <w:pStyle w:val="Compact"/>
         <w:numPr>
           <w:ilvl w:val="0"/>
-          <w:numId w:val="1014"/>
+          <w:numId w:val="1017"/>
         </w:numPr>
       </w:pPr>
       <w:r>
@@ -2388,7 +2388,7 @@
       <w:pPr>
         <w:numPr>
           <w:ilvl w:val="0"/>
-          <w:numId w:val="1015"/>
+          <w:numId w:val="1018"/>
         </w:numPr>
       </w:pPr>
       <w:r>
@@ -2399,7 +2399,7 @@
       <w:pPr>
         <w:numPr>
           <w:ilvl w:val="0"/>
-          <w:numId w:val="1015"/>
+          <w:numId w:val="1018"/>
         </w:numPr>
       </w:pPr>
       <w:r>
@@ -2410,7 +2410,7 @@
       <w:pPr>
         <w:numPr>
           <w:ilvl w:val="0"/>
-          <w:numId w:val="1015"/>
+          <w:numId w:val="1018"/>
         </w:numPr>
       </w:pPr>
       <w:r>
@@ -2421,7 +2421,7 @@
       <w:pPr>
         <w:numPr>
           <w:ilvl w:val="0"/>
-          <w:numId w:val="1015"/>
+          <w:numId w:val="1018"/>
         </w:numPr>
       </w:pPr>
       <w:r>
@@ -2432,7 +2432,7 @@
       <w:pPr>
         <w:numPr>
           <w:ilvl w:val="0"/>
-          <w:numId w:val="1015"/>
+          <w:numId w:val="1018"/>
         </w:numPr>
       </w:pPr>
       <w:r>
@@ -2443,7 +2443,7 @@
       <w:pPr>
         <w:numPr>
           <w:ilvl w:val="0"/>
-          <w:numId w:val="1015"/>
+          <w:numId w:val="1018"/>
         </w:numPr>
       </w:pPr>
       <w:r>
@@ -2464,7 +2464,7 @@
       <w:pPr>
         <w:numPr>
           <w:ilvl w:val="0"/>
-          <w:numId w:val="1016"/>
+          <w:numId w:val="1019"/>
         </w:numPr>
       </w:pPr>
       <w:r>
@@ -2475,7 +2475,7 @@
       <w:pPr>
         <w:numPr>
           <w:ilvl w:val="0"/>
-          <w:numId w:val="1016"/>
+          <w:numId w:val="1019"/>
         </w:numPr>
       </w:pPr>
       <w:r>
@@ -2486,7 +2486,7 @@
       <w:pPr>
         <w:numPr>
           <w:ilvl w:val="0"/>
-          <w:numId w:val="1016"/>
+          <w:numId w:val="1019"/>
         </w:numPr>
       </w:pPr>
       <w:r>
@@ -2497,7 +2497,7 @@
       <w:pPr>
         <w:numPr>
           <w:ilvl w:val="0"/>
-          <w:numId w:val="1016"/>
+          <w:numId w:val="1019"/>
         </w:numPr>
       </w:pPr>
       <w:r>
@@ -2508,7 +2508,7 @@
       <w:pPr>
         <w:numPr>
           <w:ilvl w:val="0"/>
-          <w:numId w:val="1016"/>
+          <w:numId w:val="1019"/>
         </w:numPr>
       </w:pPr>
       <w:r>
@@ -2519,7 +2519,7 @@
       <w:pPr>
         <w:numPr>
           <w:ilvl w:val="0"/>
-          <w:numId w:val="1016"/>
+          <w:numId w:val="1019"/>
         </w:numPr>
       </w:pPr>
       <w:r>
@@ -2540,7 +2540,7 @@
       <w:pPr>
         <w:numPr>
           <w:ilvl w:val="0"/>
-          <w:numId w:val="1017"/>
+          <w:numId w:val="1020"/>
         </w:numPr>
       </w:pPr>
       <w:r>
@@ -2551,7 +2551,7 @@
       <w:pPr>
         <w:numPr>
           <w:ilvl w:val="0"/>
-          <w:numId w:val="1017"/>
+          <w:numId w:val="1020"/>
         </w:numPr>
       </w:pPr>
       <w:r>
@@ -2562,7 +2562,7 @@
       <w:pPr>
         <w:numPr>
           <w:ilvl w:val="0"/>
-          <w:numId w:val="1017"/>
+          <w:numId w:val="1020"/>
         </w:numPr>
       </w:pPr>
       <w:r>
@@ -2573,7 +2573,7 @@
       <w:pPr>
         <w:numPr>
           <w:ilvl w:val="0"/>
-          <w:numId w:val="1017"/>
+          <w:numId w:val="1020"/>
         </w:numPr>
       </w:pPr>
       <w:r>
@@ -2594,7 +2594,7 @@
       <w:pPr>
         <w:numPr>
           <w:ilvl w:val="0"/>
-          <w:numId w:val="1018"/>
+          <w:numId w:val="1021"/>
         </w:numPr>
       </w:pPr>
       <w:r>
@@ -2605,7 +2605,7 @@
       <w:pPr>
         <w:numPr>
           <w:ilvl w:val="0"/>
-          <w:numId w:val="1018"/>
+          <w:numId w:val="1021"/>
         </w:numPr>
       </w:pPr>
       <w:r>
@@ -2616,7 +2616,7 @@
       <w:pPr>
         <w:numPr>
           <w:ilvl w:val="0"/>
-          <w:numId w:val="1018"/>
+          <w:numId w:val="1021"/>
         </w:numPr>
       </w:pPr>
       <w:r>
@@ -2637,7 +2637,7 @@
       <w:pPr>
         <w:numPr>
           <w:ilvl w:val="0"/>
-          <w:numId w:val="1019"/>
+          <w:numId w:val="1022"/>
         </w:numPr>
       </w:pPr>
       <w:r>
@@ -2648,7 +2648,7 @@
       <w:pPr>
         <w:numPr>
           <w:ilvl w:val="0"/>
-          <w:numId w:val="1019"/>
+          <w:numId w:val="1022"/>
         </w:numPr>
       </w:pPr>
       <w:r>
@@ -2659,7 +2659,7 @@
       <w:pPr>
         <w:numPr>
           <w:ilvl w:val="0"/>
-          <w:numId w:val="1019"/>
+          <w:numId w:val="1022"/>
         </w:numPr>
       </w:pPr>
       <w:r>
@@ -2680,7 +2680,7 @@
       <w:pPr>
         <w:numPr>
           <w:ilvl w:val="0"/>
-          <w:numId w:val="1020"/>
+          <w:numId w:val="1023"/>
         </w:numPr>
       </w:pPr>
       <w:r>
@@ -2691,7 +2691,7 @@
       <w:pPr>
         <w:numPr>
           <w:ilvl w:val="0"/>
-          <w:numId w:val="1020"/>
+          <w:numId w:val="1023"/>
         </w:numPr>
       </w:pPr>
       <w:r>
@@ -2702,7 +2702,7 @@
       <w:pPr>
         <w:numPr>
           <w:ilvl w:val="0"/>
-          <w:numId w:val="1020"/>
+          <w:numId w:val="1023"/>
         </w:numPr>
       </w:pPr>
       <w:r>
@@ -2713,7 +2713,7 @@
       <w:pPr>
         <w:numPr>
           <w:ilvl w:val="0"/>
-          <w:numId w:val="1020"/>
+          <w:numId w:val="1023"/>
         </w:numPr>
       </w:pPr>
       <w:r>
@@ -2724,7 +2724,7 @@
       <w:pPr>
         <w:numPr>
           <w:ilvl w:val="0"/>
-          <w:numId w:val="1020"/>
+          <w:numId w:val="1023"/>
         </w:numPr>
       </w:pPr>
       <w:r>
@@ -2735,7 +2735,7 @@
       <w:pPr>
         <w:numPr>
           <w:ilvl w:val="0"/>
-          <w:numId w:val="1020"/>
+          <w:numId w:val="1023"/>
         </w:numPr>
       </w:pPr>
       <w:r>
@@ -2765,7 +2765,7 @@
         <w:pStyle w:val="Compact"/>
         <w:numPr>
           <w:ilvl w:val="0"/>
-          <w:numId w:val="1021"/>
+          <w:numId w:val="1024"/>
         </w:numPr>
       </w:pPr>
       <w:r>
@@ -2777,7 +2777,7 @@
         <w:pStyle w:val="Compact"/>
         <w:numPr>
           <w:ilvl w:val="0"/>
-          <w:numId w:val="1021"/>
+          <w:numId w:val="1024"/>
         </w:numPr>
       </w:pPr>
       <w:r>
@@ -2789,7 +2789,7 @@
         <w:pStyle w:val="Compact"/>
         <w:numPr>
           <w:ilvl w:val="0"/>
-          <w:numId w:val="1021"/>
+          <w:numId w:val="1024"/>
         </w:numPr>
       </w:pPr>
       <w:r>
@@ -2801,7 +2801,7 @@
         <w:pStyle w:val="Compact"/>
         <w:numPr>
           <w:ilvl w:val="0"/>
-          <w:numId w:val="1021"/>
+          <w:numId w:val="1024"/>
         </w:numPr>
       </w:pPr>
       <w:r>
@@ -2813,7 +2813,7 @@
         <w:pStyle w:val="Compact"/>
         <w:numPr>
           <w:ilvl w:val="0"/>
-          <w:numId w:val="1021"/>
+          <w:numId w:val="1024"/>
         </w:numPr>
       </w:pPr>
       <w:r>
@@ -2825,7 +2825,7 @@
         <w:pStyle w:val="Compact"/>
         <w:numPr>
           <w:ilvl w:val="0"/>
-          <w:numId w:val="1021"/>
+          <w:numId w:val="1024"/>
         </w:numPr>
       </w:pPr>
       <w:r>
@@ -2837,7 +2837,7 @@
         <w:pStyle w:val="Compact"/>
         <w:numPr>
           <w:ilvl w:val="0"/>
-          <w:numId w:val="1021"/>
+          <w:numId w:val="1024"/>
         </w:numPr>
       </w:pPr>
       <w:r>
@@ -2849,7 +2849,7 @@
         <w:pStyle w:val="Compact"/>
         <w:numPr>
           <w:ilvl w:val="0"/>
-          <w:numId w:val="1021"/>
+          <w:numId w:val="1024"/>
         </w:numPr>
       </w:pPr>
       <w:r>
@@ -2861,7 +2861,7 @@
         <w:pStyle w:val="Compact"/>
         <w:numPr>
           <w:ilvl w:val="0"/>
-          <w:numId w:val="1021"/>
+          <w:numId w:val="1024"/>
         </w:numPr>
       </w:pPr>
       <w:r>
@@ -3686,7 +3686,34 @@
     <w:abstractNumId w:val="991"/>
   </w:num>
   <w:num w:numId="1005">
-    <w:abstractNumId w:val="991"/>
+    <w:abstractNumId w:val="99411"/>
+    <w:lvlOverride w:ilvl="0">
+      <w:startOverride w:val="1"/>
+    </w:lvlOverride>
+    <w:lvlOverride w:ilvl="1">
+      <w:startOverride w:val="1"/>
+    </w:lvlOverride>
+    <w:lvlOverride w:ilvl="2">
+      <w:startOverride w:val="1"/>
+    </w:lvlOverride>
+    <w:lvlOverride w:ilvl="3">
+      <w:startOverride w:val="1"/>
+    </w:lvlOverride>
+    <w:lvlOverride w:ilvl="4">
+      <w:startOverride w:val="1"/>
+    </w:lvlOverride>
+    <w:lvlOverride w:ilvl="5">
+      <w:startOverride w:val="1"/>
+    </w:lvlOverride>
+    <w:lvlOverride w:ilvl="6">
+      <w:startOverride w:val="1"/>
+    </w:lvlOverride>
+    <w:lvlOverride w:ilvl="7">
+      <w:startOverride w:val="1"/>
+    </w:lvlOverride>
+    <w:lvlOverride w:ilvl="8">
+      <w:startOverride w:val="1"/>
+    </w:lvlOverride>
   </w:num>
   <w:num w:numId="1006">
     <w:abstractNumId w:val="991"/>
@@ -3734,9 +3761,39 @@
     <w:abstractNumId w:val="991"/>
   </w:num>
   <w:num w:numId="1012">
+    <w:abstractNumId w:val="99411"/>
+    <w:lvlOverride w:ilvl="0">
+      <w:startOverride w:val="1"/>
+    </w:lvlOverride>
+    <w:lvlOverride w:ilvl="1">
+      <w:startOverride w:val="1"/>
+    </w:lvlOverride>
+    <w:lvlOverride w:ilvl="2">
+      <w:startOverride w:val="1"/>
+    </w:lvlOverride>
+    <w:lvlOverride w:ilvl="3">
+      <w:startOverride w:val="1"/>
+    </w:lvlOverride>
+    <w:lvlOverride w:ilvl="4">
+      <w:startOverride w:val="1"/>
+    </w:lvlOverride>
+    <w:lvlOverride w:ilvl="5">
+      <w:startOverride w:val="1"/>
+    </w:lvlOverride>
+    <w:lvlOverride w:ilvl="6">
+      <w:startOverride w:val="1"/>
+    </w:lvlOverride>
+    <w:lvlOverride w:ilvl="7">
+      <w:startOverride w:val="1"/>
+    </w:lvlOverride>
+    <w:lvlOverride w:ilvl="8">
+      <w:startOverride w:val="1"/>
+    </w:lvlOverride>
+  </w:num>
+  <w:num w:numId="1013">
     <w:abstractNumId w:val="991"/>
   </w:num>
-  <w:num w:numId="1013">
+  <w:num w:numId="1014">
     <w:abstractNumId w:val="99411"/>
     <w:lvlOverride w:ilvl="0">
       <w:startOverride w:val="1"/>
@@ -3766,10 +3823,10 @@
       <w:startOverride w:val="1"/>
     </w:lvlOverride>
   </w:num>
-  <w:num w:numId="1014">
+  <w:num w:numId="1015">
     <w:abstractNumId w:val="991"/>
   </w:num>
-  <w:num w:numId="1015">
+  <w:num w:numId="1016">
     <w:abstractNumId w:val="99411"/>
     <w:lvlOverride w:ilvl="0">
       <w:startOverride w:val="1"/>
@@ -3799,7 +3856,40 @@
       <w:startOverride w:val="1"/>
     </w:lvlOverride>
   </w:num>
-  <w:num w:numId="1016">
+  <w:num w:numId="1017">
+    <w:abstractNumId w:val="991"/>
+  </w:num>
+  <w:num w:numId="1018">
+    <w:abstractNumId w:val="99411"/>
+    <w:lvlOverride w:ilvl="0">
+      <w:startOverride w:val="1"/>
+    </w:lvlOverride>
+    <w:lvlOverride w:ilvl="1">
+      <w:startOverride w:val="1"/>
+    </w:lvlOverride>
+    <w:lvlOverride w:ilvl="2">
+      <w:startOverride w:val="1"/>
+    </w:lvlOverride>
+    <w:lvlOverride w:ilvl="3">
+      <w:startOverride w:val="1"/>
+    </w:lvlOverride>
+    <w:lvlOverride w:ilvl="4">
+      <w:startOverride w:val="1"/>
+    </w:lvlOverride>
+    <w:lvlOverride w:ilvl="5">
+      <w:startOverride w:val="1"/>
+    </w:lvlOverride>
+    <w:lvlOverride w:ilvl="6">
+      <w:startOverride w:val="1"/>
+    </w:lvlOverride>
+    <w:lvlOverride w:ilvl="7">
+      <w:startOverride w:val="1"/>
+    </w:lvlOverride>
+    <w:lvlOverride w:ilvl="8">
+      <w:startOverride w:val="1"/>
+    </w:lvlOverride>
+  </w:num>
+  <w:num w:numId="1019">
     <w:abstractNumId w:val="99417"/>
     <w:lvlOverride w:ilvl="0">
       <w:startOverride w:val="7"/>
@@ -3829,7 +3919,7 @@
       <w:startOverride w:val="7"/>
     </w:lvlOverride>
   </w:num>
-  <w:num w:numId="1017">
+  <w:num w:numId="1020">
     <w:abstractNumId w:val="994113"/>
     <w:lvlOverride w:ilvl="0">
       <w:startOverride w:val="13"/>
@@ -3859,7 +3949,7 @@
       <w:startOverride w:val="13"/>
     </w:lvlOverride>
   </w:num>
-  <w:num w:numId="1018">
+  <w:num w:numId="1021">
     <w:abstractNumId w:val="994117"/>
     <w:lvlOverride w:ilvl="0">
       <w:startOverride w:val="17"/>
@@ -3889,7 +3979,7 @@
       <w:startOverride w:val="17"/>
     </w:lvlOverride>
   </w:num>
-  <w:num w:numId="1019">
+  <w:num w:numId="1022">
     <w:abstractNumId w:val="994120"/>
     <w:lvlOverride w:ilvl="0">
       <w:startOverride w:val="20"/>
@@ -3919,7 +4009,7 @@
       <w:startOverride w:val="20"/>
     </w:lvlOverride>
   </w:num>
-  <w:num w:numId="1020">
+  <w:num w:numId="1023">
     <w:abstractNumId w:val="994123"/>
     <w:lvlOverride w:ilvl="0">
       <w:startOverride w:val="23"/>
@@ -3949,7 +4039,7 @@
       <w:startOverride w:val="23"/>
     </w:lvlOverride>
   </w:num>
-  <w:num w:numId="1021">
+  <w:num w:numId="1024">
     <w:abstractNumId w:val="991"/>
   </w:num>
 </w:numbering>

</xml_diff>